<commit_message>
docs: format math block equations for GitHub native LaTeX rendering
</commit_message>
<xml_diff>
--- a/output/PyThinFilm_作品说明书_修订版初稿.docx
+++ b/output/PyThinFilm_作品说明书_修订版初稿.docx
@@ -1913,6 +1913,8 @@
           <w:sz w:val="21"/>
         </w:rPr>
       </w:r>
+    </w:p>
+    <w:p>
       <w:r>
         <w:rPr>
           <w:rFonts w:ascii="SimSun" w:hAnsi="SimSun"/>
@@ -1920,6 +1922,8 @@
         </w:rPr>
         <w:t>r_s = \frac{n_1 \cos\theta_i - n_2 \cos\theta_t}{n_1 \cos\theta_i + n_2 \cos\theta_t}, \quad t_s = \frac{2n_1 \cos\theta_i}{n_1 \cos\theta_i + n_2 \cos\theta_t}</w:t>
       </w:r>
+    </w:p>
+    <w:p>
       <w:r>
         <w:rPr>
           <w:rFonts w:ascii="Times New Roman" w:hAnsi="Times New Roman"/>
@@ -1938,6 +1942,8 @@
           <w:sz w:val="21"/>
         </w:rPr>
       </w:r>
+    </w:p>
+    <w:p>
       <w:r>
         <w:rPr>
           <w:rFonts w:ascii="SimSun" w:hAnsi="SimSun"/>
@@ -1945,6 +1951,8 @@
         </w:rPr>
         <w:t>r_p = \frac{n_2 \cos\theta_i - n_1 \cos\theta_t}{n_2 \cos\theta_i + n_1 \cos\theta_t}, \quad t_p = \frac{2n_1 \cos\theta_i}{n_2 \cos\theta_i + n_1 \cos\theta_t}</w:t>
       </w:r>
+    </w:p>
+    <w:p>
       <w:r>
         <w:rPr>
           <w:rFonts w:ascii="Times New Roman" w:hAnsi="Times New Roman"/>
@@ -2059,6 +2067,8 @@
           <w:sz w:val="21"/>
         </w:rPr>
       </w:r>
+    </w:p>
+    <w:p>
       <w:r>
         <w:rPr>
           <w:rFonts w:ascii="SimSun" w:hAnsi="SimSun"/>
@@ -2066,6 +2076,8 @@
         </w:rPr>
         <w:t>\delta_j = \frac{2\pi}{\lambda} \tilde{n}_j d_j \cos\theta_j</w:t>
       </w:r>
+    </w:p>
+    <w:p>
       <w:r>
         <w:rPr>
           <w:rFonts w:ascii="Times New Roman" w:hAnsi="Times New Roman"/>
@@ -2306,6 +2318,8 @@
           <w:sz w:val="21"/>
         </w:rPr>
       </w:r>
+    </w:p>
+    <w:p>
       <w:r>
         <w:rPr>
           <w:rFonts w:ascii="SimSun" w:hAnsi="SimSun"/>
@@ -2313,6 +2327,8 @@
         </w:rPr>
         <w:t>\begin{pmatrix} E_{j-1} \\ H_{j-1} \end{pmatrix} = \begin{pmatrix} \cos\delta_j &amp; \frac{i}{\eta_j}\sin\delta_j \\ i\eta_j\sin\delta_j &amp; \cos\delta_j \end{pmatrix} \begin{pmatrix} E_j \\ H_j \end{pmatrix} = M_j \begin{pmatrix} E_j \\ H_j \end{pmatrix}</w:t>
       </w:r>
+    </w:p>
+    <w:p>
       <w:r>
         <w:rPr>
           <w:rFonts w:ascii="Times New Roman" w:hAnsi="Times New Roman"/>
@@ -2397,6 +2413,8 @@
           <w:sz w:val="21"/>
         </w:rPr>
       </w:r>
+    </w:p>
+    <w:p>
       <w:r>
         <w:rPr>
           <w:rFonts w:ascii="SimSun" w:hAnsi="SimSun"/>
@@ -2404,6 +2422,8 @@
         </w:rPr>
         <w:t>\eta_{j,TE} = \tilde{n}_j \cos\theta_j</w:t>
       </w:r>
+    </w:p>
+    <w:p>
       <w:r>
         <w:rPr>
           <w:rFonts w:ascii="Times New Roman" w:hAnsi="Times New Roman"/>
@@ -2431,6 +2451,8 @@
           <w:sz w:val="21"/>
         </w:rPr>
       </w:r>
+    </w:p>
+    <w:p>
       <w:r>
         <w:rPr>
           <w:rFonts w:ascii="SimSun" w:hAnsi="SimSun"/>
@@ -2438,6 +2460,8 @@
         </w:rPr>
         <w:t>\eta_{j,TM} = \frac{\tilde{n}_j}{\cos\theta_j}</w:t>
       </w:r>
+    </w:p>
+    <w:p>
       <w:r>
         <w:rPr>
           <w:rFonts w:ascii="Times New Roman" w:hAnsi="Times New Roman"/>
@@ -2511,6 +2535,8 @@
           <w:sz w:val="21"/>
         </w:rPr>
       </w:r>
+    </w:p>
+    <w:p>
       <w:r>
         <w:rPr>
           <w:rFonts w:ascii="SimSun" w:hAnsi="SimSun"/>
@@ -2518,6 +2544,8 @@
         </w:rPr>
         <w:t>M = \prod_{j=1}^{N} M_j = M_1 M_2 \cdots M_N = \begin{pmatrix} m_{11} &amp; m_{12} \\ m_{21} &amp; m_{22} \end{pmatrix}</w:t>
       </w:r>
+    </w:p>
+    <w:p>
       <w:r>
         <w:rPr>
           <w:rFonts w:ascii="Times New Roman" w:hAnsi="Times New Roman"/>
@@ -2623,6 +2651,8 @@
           <w:sz w:val="21"/>
         </w:rPr>
       </w:r>
+    </w:p>
+    <w:p>
       <w:r>
         <w:rPr>
           <w:rFonts w:ascii="SimSun" w:hAnsi="SimSun"/>
@@ -2630,6 +2660,8 @@
         </w:rPr>
         <w:t>r = \frac{\eta_0 (m_{11} + \eta_s m_{12}) - (m_{21} + \eta_s m_{22})}{\eta_0 (m_{11} + \eta_s m_{12}) + (m_{21} + \eta_s m_{22})}</w:t>
       </w:r>
+    </w:p>
+    <w:p>
       <w:r>
         <w:rPr>
           <w:rFonts w:ascii="Times New Roman" w:hAnsi="Times New Roman"/>
@@ -2648,6 +2680,8 @@
           <w:sz w:val="21"/>
         </w:rPr>
       </w:r>
+    </w:p>
+    <w:p>
       <w:r>
         <w:rPr>
           <w:rFonts w:ascii="SimSun" w:hAnsi="SimSun"/>
@@ -2655,6 +2689,8 @@
         </w:rPr>
         <w:t>t = \frac{2\eta_0}{\eta_0 (m_{11} + \eta_s m_{12}) + (m_{21} + \eta_s m_{22})}</w:t>
       </w:r>
+    </w:p>
+    <w:p>
       <w:r>
         <w:rPr>
           <w:rFonts w:ascii="Times New Roman" w:hAnsi="Times New Roman"/>
@@ -2730,6 +2766,8 @@
           <w:sz w:val="21"/>
         </w:rPr>
       </w:r>
+    </w:p>
+    <w:p>
       <w:r>
         <w:rPr>
           <w:rFonts w:ascii="SimSun" w:hAnsi="SimSun"/>
@@ -2737,6 +2775,8 @@
         </w:rPr>
         <w:t>R = |r|^2</w:t>
       </w:r>
+    </w:p>
+    <w:p>
       <w:r>
         <w:rPr>
           <w:rFonts w:ascii="Times New Roman" w:hAnsi="Times New Roman"/>
@@ -2755,6 +2795,8 @@
           <w:sz w:val="21"/>
         </w:rPr>
       </w:r>
+    </w:p>
+    <w:p>
       <w:r>
         <w:rPr>
           <w:rFonts w:ascii="SimSun" w:hAnsi="SimSun"/>
@@ -2762,6 +2804,8 @@
         </w:rPr>
         <w:t>T = \frac{\text{Re}(\eta_s)}{\text{Re}(\eta_0)} |t|^2</w:t>
       </w:r>
+    </w:p>
+    <w:p>
       <w:r>
         <w:rPr>
           <w:rFonts w:ascii="Times New Roman" w:hAnsi="Times New Roman"/>
@@ -2780,6 +2824,8 @@
           <w:sz w:val="21"/>
         </w:rPr>
       </w:r>
+    </w:p>
+    <w:p>
       <w:r>
         <w:rPr>
           <w:rFonts w:ascii="SimSun" w:hAnsi="SimSun"/>
@@ -2787,6 +2833,8 @@
         </w:rPr>
         <w:t>A = 1 - R - T</w:t>
       </w:r>
+    </w:p>
+    <w:p>
       <w:r>
         <w:rPr>
           <w:rFonts w:ascii="Times New Roman" w:hAnsi="Times New Roman"/>
@@ -2963,6 +3011,8 @@
           <w:sz w:val="21"/>
         </w:rPr>
       </w:r>
+    </w:p>
+    <w:p>
       <w:r>
         <w:rPr>
           <w:rFonts w:ascii="SimSun" w:hAnsi="SimSun"/>
@@ -2970,6 +3020,8 @@
         </w:rPr>
         <w:t>E_j(z') = E_{j}^+ e^{-i \tilde{k}_{jz} z'} + E_{j}^- e^{i \tilde{k}_{jz} z'}</w:t>
       </w:r>
+    </w:p>
+    <w:p>
       <w:r>
         <w:rPr>
           <w:rFonts w:ascii="Times New Roman" w:hAnsi="Times New Roman"/>
@@ -3354,6 +3406,8 @@
           <w:sz w:val="21"/>
         </w:rPr>
       </w:r>
+    </w:p>
+    <w:p>
       <w:r>
         <w:rPr>
           <w:rFonts w:ascii="SimSun" w:hAnsi="SimSun"/>
@@ -3361,6 +3415,8 @@
         </w:rPr>
         <w:t>n_{eff,TE}^2 = f n_{high}^2 + (1 - f) n_{low}^2</w:t>
       </w:r>
+    </w:p>
+    <w:p>
       <w:r>
         <w:rPr>
           <w:rFonts w:ascii="Times New Roman" w:hAnsi="Times New Roman"/>
@@ -3379,6 +3435,8 @@
           <w:sz w:val="21"/>
         </w:rPr>
       </w:r>
+    </w:p>
+    <w:p>
       <w:r>
         <w:rPr>
           <w:rFonts w:ascii="SimSun" w:hAnsi="SimSun"/>
@@ -3386,6 +3444,8 @@
         </w:rPr>
         <w:t>\frac{1}{n_{eff,TM}^2} = \frac{f}{n_{high}^2} + \frac{1 - f}{n_{low}^2}</w:t>
       </w:r>
+    </w:p>
+    <w:p>
       <w:r>
         <w:rPr>
           <w:rFonts w:ascii="Times New Roman" w:hAnsi="Times New Roman"/>
@@ -3802,6 +3862,8 @@
           <w:sz w:val="21"/>
         </w:rPr>
       </w:r>
+    </w:p>
+    <w:p>
       <w:r>
         <w:rPr>
           <w:rFonts w:ascii="SimSun" w:hAnsi="SimSun"/>
@@ -3809,6 +3871,8 @@
         </w:rPr>
         <w:t>\nabla \times \mathbf{E} = -\mu \frac{\partial \mathbf{H}}{\partial t}, \quad \nabla \times \mathbf{H} = \epsilon \frac{\partial \mathbf{E}}{\partial t}</w:t>
       </w:r>
+    </w:p>
+    <w:p>
       <w:r>
         <w:rPr>
           <w:rFonts w:ascii="Times New Roman" w:hAnsi="Times New Roman"/>
@@ -3845,6 +3909,8 @@
           <w:sz w:val="21"/>
         </w:rPr>
       </w:r>
+    </w:p>
+    <w:p>
       <w:r>
         <w:rPr>
           <w:rFonts w:ascii="SimSun" w:hAnsi="SimSun"/>
@@ -3852,6 +3918,8 @@
         </w:rPr>
         <w:t>E_{1,t} = E_{2,t}, \quad H_{1,t} = H_{2,t}</w:t>
       </w:r>
+    </w:p>
+    <w:p>
       <w:r>
         <w:rPr>
           <w:rFonts w:ascii="Times New Roman" w:hAnsi="Times New Roman"/>
@@ -3918,6 +3986,8 @@
           <w:sz w:val="21"/>
         </w:rPr>
       </w:r>
+    </w:p>
+    <w:p>
       <w:r>
         <w:rPr>
           <w:rFonts w:ascii="SimSun" w:hAnsi="SimSun"/>
@@ -3925,6 +3995,8 @@
         </w:rPr>
         <w:t>E(z) = E_0 e^{-i k_z z}</w:t>
       </w:r>
+    </w:p>
+    <w:p>
       <w:r>
         <w:rPr>
           <w:rFonts w:ascii="Times New Roman" w:hAnsi="Times New Roman"/>
@@ -3961,6 +4033,8 @@
           <w:sz w:val="21"/>
         </w:rPr>
       </w:r>
+    </w:p>
+    <w:p>
       <w:r>
         <w:rPr>
           <w:rFonts w:ascii="SimSun" w:hAnsi="SimSun"/>
@@ -3968,6 +4042,8 @@
         </w:rPr>
         <w:t>\tilde{n}(\lambda) = n(\lambda) + ik(\lambda)</w:t>
       </w:r>
+    </w:p>
+    <w:p>
       <w:r>
         <w:rPr>
           <w:rFonts w:ascii="Times New Roman" w:hAnsi="Times New Roman"/>
@@ -4082,6 +4158,8 @@
           <w:sz w:val="21"/>
         </w:rPr>
       </w:r>
+    </w:p>
+    <w:p>
       <w:r>
         <w:rPr>
           <w:rFonts w:ascii="SimSun" w:hAnsi="SimSun"/>
@@ -4089,6 +4167,8 @@
         </w:rPr>
         <w:t>R + T + A \equiv 1.0</w:t>
       </w:r>
+    </w:p>
+    <w:p>
       <w:r>
         <w:rPr>
           <w:rFonts w:ascii="Times New Roman" w:hAnsi="Times New Roman"/>
@@ -4170,6 +4250,8 @@
           <w:sz w:val="21"/>
         </w:rPr>
       </w:r>
+    </w:p>
+    <w:p>
       <w:r>
         <w:rPr>
           <w:rFonts w:ascii="SimSun" w:hAnsi="SimSun"/>
@@ -4177,6 +4259,8 @@
         </w:rPr>
         <w:t>n_j d_j = \frac{\lambda_0}{4}</w:t>
       </w:r>
+    </w:p>
+    <w:p>
       <w:r>
         <w:rPr>
           <w:rFonts w:ascii="Times New Roman" w:hAnsi="Times New Roman"/>
@@ -4229,6 +4313,8 @@
           <w:sz w:val="21"/>
         </w:rPr>
       </w:r>
+    </w:p>
+    <w:p>
       <w:r>
         <w:rPr>
           <w:rFonts w:ascii="SimSun" w:hAnsi="SimSun"/>
@@ -4236,6 +4322,8 @@
         </w:rPr>
         <w:t>\Delta\phi = \phi_{left}(\lambda) + \phi_{right}(\lambda) = 2m\pi \quad (m \in \mathbb{Z})</w:t>
       </w:r>
+    </w:p>
+    <w:p>
       <w:r>
         <w:rPr>
           <w:rFonts w:ascii="Times New Roman" w:hAnsi="Times New Roman"/>

</xml_diff>

<commit_message>
docs: use quadruple backslashes for matrix newlines in README & instruction book for GitHub MathJax compatibility and standardize unit ranges to en-dash
</commit_message>
<xml_diff>
--- a/output/PyThinFilm_作品说明书_修订版初稿.docx
+++ b/output/PyThinFilm_作品说明书_修订版初稿.docx
@@ -1905,6 +1905,10 @@
       </w:r>
     </w:p>
     <w:p>
+      <w:pPr>
+        <w:spacing w:before="120" w:after="120"/>
+        <w:jc w:val="center"/>
+      </w:pPr>
       <w:r>
         <w:rPr>
           <w:rFonts w:ascii="Times New Roman" w:hAnsi="Times New Roman"/>
@@ -1912,18 +1916,14 @@
           <w:color w:val="505050"/>
           <w:sz w:val="21"/>
         </w:rPr>
-      </w:r>
-    </w:p>
-    <w:p>
-      <w:r>
-        <w:rPr>
-          <w:rFonts w:ascii="SimSun" w:hAnsi="SimSun"/>
-          <w:sz w:val="21"/>
-        </w:rPr>
         <w:t>r_s = \frac{n_1 \cos\theta_i - n_2 \cos\theta_t}{n_1 \cos\theta_i + n_2 \cos\theta_t}, \quad t_s = \frac{2n_1 \cos\theta_i}{n_1 \cos\theta_i + n_2 \cos\theta_t}</w:t>
       </w:r>
     </w:p>
     <w:p>
+      <w:pPr>
+        <w:spacing w:before="120" w:after="120"/>
+        <w:jc w:val="center"/>
+      </w:pPr>
       <w:r>
         <w:rPr>
           <w:rFonts w:ascii="Times New Roman" w:hAnsi="Times New Roman"/>
@@ -1931,9 +1931,17 @@
           <w:color w:val="505050"/>
           <w:sz w:val="21"/>
         </w:rPr>
-      </w:r>
-    </w:p>
-    <w:p>
+        <w:t>r_p = \frac{n_2 \cos\theta_i - n_1 \cos\theta_t}{n_2 \cos\theta_i + n_1 \cos\theta_t}, \quad t_p = \frac{2n_1 \cos\theta_i}{n_2 \cos\theta_i + n_1 \cos\theta_t}</w:t>
+      </w:r>
+    </w:p>
+    <w:p>
+      <w:r>
+        <w:rPr>
+          <w:rFonts w:ascii="SimSun" w:hAnsi="SimSun"/>
+          <w:sz w:val="21"/>
+        </w:rPr>
+        <w:t xml:space="preserve">其中 </w:t>
+      </w:r>
       <w:r>
         <w:rPr>
           <w:rFonts w:ascii="Times New Roman" w:hAnsi="Times New Roman"/>
@@ -1941,18 +1949,15 @@
           <w:color w:val="505050"/>
           <w:sz w:val="21"/>
         </w:rPr>
-      </w:r>
-    </w:p>
-    <w:p>
-      <w:r>
-        <w:rPr>
-          <w:rFonts w:ascii="SimSun" w:hAnsi="SimSun"/>
-          <w:sz w:val="21"/>
-        </w:rPr>
-        <w:t>r_p = \frac{n_2 \cos\theta_i - n_1 \cos\theta_t}{n_2 \cos\theta_i + n_1 \cos\theta_t}, \quad t_p = \frac{2n_1 \cos\theta_i}{n_2 \cos\theta_i + n_1 \cos\theta_t}</w:t>
-      </w:r>
-    </w:p>
-    <w:p>
+        <w:t>\theta_t</w:t>
+      </w:r>
+      <w:r>
+        <w:rPr>
+          <w:rFonts w:ascii="SimSun" w:hAnsi="SimSun"/>
+          <w:sz w:val="21"/>
+        </w:rPr>
+        <w:t xml:space="preserve"> 为折射角，由折射定律 </w:t>
+      </w:r>
       <w:r>
         <w:rPr>
           <w:rFonts w:ascii="Times New Roman" w:hAnsi="Times New Roman"/>
@@ -1960,15 +1965,37 @@
           <w:color w:val="505050"/>
           <w:sz w:val="21"/>
         </w:rPr>
-      </w:r>
-    </w:p>
-    <w:p>
-      <w:r>
-        <w:rPr>
-          <w:rFonts w:ascii="SimSun" w:hAnsi="SimSun"/>
-          <w:sz w:val="21"/>
-        </w:rPr>
-        <w:t xml:space="preserve">其中 </w:t>
+        <w:t>n_1 \sin\theta_i = n_2 \sin\theta_t</w:t>
+      </w:r>
+      <w:r>
+        <w:rPr>
+          <w:rFonts w:ascii="SimSun" w:hAnsi="SimSun"/>
+          <w:sz w:val="21"/>
+        </w:rPr>
+        <w:t xml:space="preserve"> 确定。</w:t>
+      </w:r>
+    </w:p>
+    <w:p>
+      <w:pPr>
+        <w:keepNext/>
+        <w:spacing w:before="80" w:after="40"/>
+      </w:pPr>
+      <w:r>
+        <w:rPr>
+          <w:rFonts w:ascii="SimHei" w:hAnsi="SimHei"/>
+          <w:b/>
+          <w:sz w:val="21"/>
+        </w:rPr>
+        <w:t>2.1.3 多光束干涉与薄膜相位差</w:t>
+      </w:r>
+    </w:p>
+    <w:p>
+      <w:r>
+        <w:rPr>
+          <w:rFonts w:ascii="SimSun" w:hAnsi="SimSun"/>
+          <w:sz w:val="21"/>
+        </w:rPr>
+        <w:t xml:space="preserve">若介质为平面薄膜，当厚度与波长可比拟时，电磁波在薄膜的上下两个分界面处会发生无限次往复反射与透射，反射波在膜层上表面发生干涉。相邻两次出射的干涉光波的光程差决定了总反射光谱。光波在第 </w:t>
       </w:r>
       <w:r>
         <w:rPr>
@@ -1977,14 +2004,14 @@
           <w:color w:val="505050"/>
           <w:sz w:val="21"/>
         </w:rPr>
-        <w:t>\theta_t</w:t>
-      </w:r>
-      <w:r>
-        <w:rPr>
-          <w:rFonts w:ascii="SimSun" w:hAnsi="SimSun"/>
-          <w:sz w:val="21"/>
-        </w:rPr>
-        <w:t xml:space="preserve"> 为折射角，由折射定律 </w:t>
+        <w:t>j</w:t>
+      </w:r>
+      <w:r>
+        <w:rPr>
+          <w:rFonts w:ascii="SimSun" w:hAnsi="SimSun"/>
+          <w:sz w:val="21"/>
+        </w:rPr>
+        <w:t xml:space="preserve"> 层介质中单次往返引起的光学相位延迟 </w:t>
       </w:r>
       <w:r>
         <w:rPr>
@@ -1993,38 +2020,21 @@
           <w:color w:val="505050"/>
           <w:sz w:val="21"/>
         </w:rPr>
-        <w:t>n_1 \sin\theta_i = n_2 \sin\theta_t</w:t>
-      </w:r>
-      <w:r>
-        <w:rPr>
-          <w:rFonts w:ascii="SimSun" w:hAnsi="SimSun"/>
-          <w:sz w:val="21"/>
-        </w:rPr>
-        <w:t xml:space="preserve"> 确定。</w:t>
-      </w:r>
-    </w:p>
-    <w:p>
-      <w:pPr>
-        <w:keepNext/>
-        <w:spacing w:before="80" w:after="40"/>
-      </w:pPr>
-      <w:r>
-        <w:rPr>
-          <w:rFonts w:ascii="SimHei" w:hAnsi="SimHei"/>
-          <w:b/>
-          <w:sz w:val="21"/>
-        </w:rPr>
-        <w:t>2.1.3 多光束干涉与薄膜相位差</w:t>
-      </w:r>
-    </w:p>
-    <w:p>
-      <w:r>
-        <w:rPr>
-          <w:rFonts w:ascii="SimSun" w:hAnsi="SimSun"/>
-          <w:sz w:val="21"/>
-        </w:rPr>
-        <w:t xml:space="preserve">若介质为平面薄膜，当厚度与波长可比拟时，电磁波在薄膜的上下两个分界面处会发生无限次往复反射与透射，反射波在膜层上表面发生干涉。相邻两次出射的干涉光波的光程差决定了总反射光谱。光波在第 </w:t>
-      </w:r>
+        <w:t>\delta_j</w:t>
+      </w:r>
+      <w:r>
+        <w:rPr>
+          <w:rFonts w:ascii="SimSun" w:hAnsi="SimSun"/>
+          <w:sz w:val="21"/>
+        </w:rPr>
+        <w:t xml:space="preserve"> 表示为：</w:t>
+      </w:r>
+    </w:p>
+    <w:p>
+      <w:pPr>
+        <w:spacing w:before="120" w:after="120"/>
+        <w:jc w:val="center"/>
+      </w:pPr>
       <w:r>
         <w:rPr>
           <w:rFonts w:ascii="Times New Roman" w:hAnsi="Times New Roman"/>
@@ -2032,14 +2042,16 @@
           <w:color w:val="505050"/>
           <w:sz w:val="21"/>
         </w:rPr>
-        <w:t>j</w:t>
-      </w:r>
-      <w:r>
-        <w:rPr>
-          <w:rFonts w:ascii="SimSun" w:hAnsi="SimSun"/>
-          <w:sz w:val="21"/>
-        </w:rPr>
-        <w:t xml:space="preserve"> 层介质中单次往返引起的光学相位延迟 </w:t>
+        <w:t>\delta_j = \frac{2\pi}{\lambda} \tilde{n}_j d_j \cos\theta_j</w:t>
+      </w:r>
+    </w:p>
+    <w:p>
+      <w:r>
+        <w:rPr>
+          <w:rFonts w:ascii="SimSun" w:hAnsi="SimSun"/>
+          <w:sz w:val="21"/>
+        </w:rPr>
+        <w:t xml:space="preserve">其中 </w:t>
       </w:r>
       <w:r>
         <w:rPr>
@@ -2048,17 +2060,15 @@
           <w:color w:val="505050"/>
           <w:sz w:val="21"/>
         </w:rPr>
-        <w:t>\delta_j</w:t>
-      </w:r>
-      <w:r>
-        <w:rPr>
-          <w:rFonts w:ascii="SimSun" w:hAnsi="SimSun"/>
-          <w:sz w:val="21"/>
-        </w:rPr>
-        <w:t xml:space="preserve"> 表示为：</w:t>
-      </w:r>
-    </w:p>
-    <w:p>
+        <w:t>\tilde{n}_j(\lambda) = n_j(\lambda) + ik_j(\lambda)</w:t>
+      </w:r>
+      <w:r>
+        <w:rPr>
+          <w:rFonts w:ascii="SimSun" w:hAnsi="SimSun"/>
+          <w:sz w:val="21"/>
+        </w:rPr>
+        <w:t xml:space="preserve"> 为该层介质的复折射率，其虚部用于描述材料吸收（具体正负号取决于时间因子约定），</w:t>
+      </w:r>
       <w:r>
         <w:rPr>
           <w:rFonts w:ascii="Times New Roman" w:hAnsi="Times New Roman"/>
@@ -2066,18 +2076,15 @@
           <w:color w:val="505050"/>
           <w:sz w:val="21"/>
         </w:rPr>
-      </w:r>
-    </w:p>
-    <w:p>
-      <w:r>
-        <w:rPr>
-          <w:rFonts w:ascii="SimSun" w:hAnsi="SimSun"/>
-          <w:sz w:val="21"/>
-        </w:rPr>
-        <w:t>\delta_j = \frac{2\pi}{\lambda} \tilde{n}_j d_j \cos\theta_j</w:t>
-      </w:r>
-    </w:p>
-    <w:p>
+        <w:t>d_j</w:t>
+      </w:r>
+      <w:r>
+        <w:rPr>
+          <w:rFonts w:ascii="SimSun" w:hAnsi="SimSun"/>
+          <w:sz w:val="21"/>
+        </w:rPr>
+        <w:t xml:space="preserve"> 为薄膜物理厚度，</w:t>
+      </w:r>
       <w:r>
         <w:rPr>
           <w:rFonts w:ascii="Times New Roman" w:hAnsi="Times New Roman"/>
@@ -2085,15 +2092,51 @@
           <w:color w:val="505050"/>
           <w:sz w:val="21"/>
         </w:rPr>
-      </w:r>
-    </w:p>
-    <w:p>
-      <w:r>
-        <w:rPr>
-          <w:rFonts w:ascii="SimSun" w:hAnsi="SimSun"/>
-          <w:sz w:val="21"/>
-        </w:rPr>
-        <w:t xml:space="preserve">其中 </w:t>
+        <w:t>\theta_j</w:t>
+      </w:r>
+      <w:r>
+        <w:rPr>
+          <w:rFonts w:ascii="SimSun" w:hAnsi="SimSun"/>
+          <w:sz w:val="21"/>
+        </w:rPr>
+        <w:t xml:space="preserve"> 为膜层内的折射角。</w:t>
+      </w:r>
+    </w:p>
+    <w:p>
+      <w:pPr>
+        <w:keepNext/>
+        <w:spacing w:before="120" w:after="80"/>
+      </w:pPr>
+      <w:r>
+        <w:rPr>
+          <w:rFonts w:ascii="SimHei" w:hAnsi="SimHei"/>
+          <w:b/>
+          <w:sz w:val="22"/>
+        </w:rPr>
+        <w:t>2.2 传输矩阵法 TMM</w:t>
+      </w:r>
+    </w:p>
+    <w:p>
+      <w:pPr>
+        <w:keepNext/>
+        <w:spacing w:before="80" w:after="40"/>
+      </w:pPr>
+      <w:r>
+        <w:rPr>
+          <w:rFonts w:ascii="SimHei" w:hAnsi="SimHei"/>
+          <w:b/>
+          <w:sz w:val="21"/>
+        </w:rPr>
+        <w:t>2.2.1 单层膜特征矩阵</w:t>
+      </w:r>
+    </w:p>
+    <w:p>
+      <w:r>
+        <w:rPr>
+          <w:rFonts w:ascii="SimSun" w:hAnsi="SimSun"/>
+          <w:sz w:val="21"/>
+        </w:rPr>
+        <w:t xml:space="preserve">传输矩阵法通过一维边界条件级联，求解多层平面薄膜的场关系。对于第 </w:t>
       </w:r>
       <w:r>
         <w:rPr>
@@ -2102,14 +2145,14 @@
           <w:color w:val="505050"/>
           <w:sz w:val="21"/>
         </w:rPr>
-        <w:t>\tilde{n}_j(\lambda) = n_j(\lambda) + ik_j(\lambda)</w:t>
-      </w:r>
-      <w:r>
-        <w:rPr>
-          <w:rFonts w:ascii="SimSun" w:hAnsi="SimSun"/>
-          <w:sz w:val="21"/>
-        </w:rPr>
-        <w:t xml:space="preserve"> 为该层介质的复折射率，其虚部用于描述材料吸收（具体正负号取决于时间因子约定），</w:t>
+        <w:t>j</w:t>
+      </w:r>
+      <w:r>
+        <w:rPr>
+          <w:rFonts w:ascii="SimSun" w:hAnsi="SimSun"/>
+          <w:sz w:val="21"/>
+        </w:rPr>
+        <w:t xml:space="preserve"> 层平面介质薄膜，其左边界 </w:t>
       </w:r>
       <w:r>
         <w:rPr>
@@ -2118,14 +2161,14 @@
           <w:color w:val="505050"/>
           <w:sz w:val="21"/>
         </w:rPr>
-        <w:t>d_j</w:t>
-      </w:r>
-      <w:r>
-        <w:rPr>
-          <w:rFonts w:ascii="SimSun" w:hAnsi="SimSun"/>
-          <w:sz w:val="21"/>
-        </w:rPr>
-        <w:t xml:space="preserve"> 为薄膜物理厚度，</w:t>
+        <w:t>j-1</w:t>
+      </w:r>
+      <w:r>
+        <w:rPr>
+          <w:rFonts w:ascii="SimSun" w:hAnsi="SimSun"/>
+          <w:sz w:val="21"/>
+        </w:rPr>
+        <w:t xml:space="preserve"> 处的切向场（电场 </w:t>
       </w:r>
       <w:r>
         <w:rPr>
@@ -2134,51 +2177,14 @@
           <w:color w:val="505050"/>
           <w:sz w:val="21"/>
         </w:rPr>
-        <w:t>\theta_j</w:t>
-      </w:r>
-      <w:r>
-        <w:rPr>
-          <w:rFonts w:ascii="SimSun" w:hAnsi="SimSun"/>
-          <w:sz w:val="21"/>
-        </w:rPr>
-        <w:t xml:space="preserve"> 为膜层内的折射角。</w:t>
-      </w:r>
-    </w:p>
-    <w:p>
-      <w:pPr>
-        <w:keepNext/>
-        <w:spacing w:before="120" w:after="80"/>
-      </w:pPr>
-      <w:r>
-        <w:rPr>
-          <w:rFonts w:ascii="SimHei" w:hAnsi="SimHei"/>
-          <w:b/>
-          <w:sz w:val="22"/>
-        </w:rPr>
-        <w:t>2.2 传输矩阵法 TMM</w:t>
-      </w:r>
-    </w:p>
-    <w:p>
-      <w:pPr>
-        <w:keepNext/>
-        <w:spacing w:before="80" w:after="40"/>
-      </w:pPr>
-      <w:r>
-        <w:rPr>
-          <w:rFonts w:ascii="SimHei" w:hAnsi="SimHei"/>
-          <w:b/>
-          <w:sz w:val="21"/>
-        </w:rPr>
-        <w:t>2.2.1 单层膜特征矩阵</w:t>
-      </w:r>
-    </w:p>
-    <w:p>
-      <w:r>
-        <w:rPr>
-          <w:rFonts w:ascii="SimSun" w:hAnsi="SimSun"/>
-          <w:sz w:val="21"/>
-        </w:rPr>
-        <w:t xml:space="preserve">传输矩阵法通过一维边界条件级联，求解多层平面薄膜的场关系。对于第 </w:t>
+        <w:t>E_{j-1}</w:t>
+      </w:r>
+      <w:r>
+        <w:rPr>
+          <w:rFonts w:ascii="SimSun" w:hAnsi="SimSun"/>
+          <w:sz w:val="21"/>
+        </w:rPr>
+        <w:t xml:space="preserve">，磁场 </w:t>
       </w:r>
       <w:r>
         <w:rPr>
@@ -2187,14 +2193,14 @@
           <w:color w:val="505050"/>
           <w:sz w:val="21"/>
         </w:rPr>
-        <w:t>j</w:t>
-      </w:r>
-      <w:r>
-        <w:rPr>
-          <w:rFonts w:ascii="SimSun" w:hAnsi="SimSun"/>
-          <w:sz w:val="21"/>
-        </w:rPr>
-        <w:t xml:space="preserve"> 层平面介质薄膜，其左边界 </w:t>
+        <w:t>H_{j-1}</w:t>
+      </w:r>
+      <w:r>
+        <w:rPr>
+          <w:rFonts w:ascii="SimSun" w:hAnsi="SimSun"/>
+          <w:sz w:val="21"/>
+        </w:rPr>
+        <w:t xml:space="preserve">）与右边界 </w:t>
       </w:r>
       <w:r>
         <w:rPr>
@@ -2203,14 +2209,14 @@
           <w:color w:val="505050"/>
           <w:sz w:val="21"/>
         </w:rPr>
-        <w:t>j-1</w:t>
-      </w:r>
-      <w:r>
-        <w:rPr>
-          <w:rFonts w:ascii="SimSun" w:hAnsi="SimSun"/>
-          <w:sz w:val="21"/>
-        </w:rPr>
-        <w:t xml:space="preserve"> 处的切向场（电场 </w:t>
+        <w:t>j</w:t>
+      </w:r>
+      <w:r>
+        <w:rPr>
+          <w:rFonts w:ascii="SimSun" w:hAnsi="SimSun"/>
+          <w:sz w:val="21"/>
+        </w:rPr>
+        <w:t xml:space="preserve"> 处的切向场（</w:t>
       </w:r>
       <w:r>
         <w:rPr>
@@ -2219,14 +2225,14 @@
           <w:color w:val="505050"/>
           <w:sz w:val="21"/>
         </w:rPr>
-        <w:t>E_{j-1}</w:t>
-      </w:r>
-      <w:r>
-        <w:rPr>
-          <w:rFonts w:ascii="SimSun" w:hAnsi="SimSun"/>
-          <w:sz w:val="21"/>
-        </w:rPr>
-        <w:t xml:space="preserve">，磁场 </w:t>
+        <w:t>E_j</w:t>
+      </w:r>
+      <w:r>
+        <w:rPr>
+          <w:rFonts w:ascii="SimSun" w:hAnsi="SimSun"/>
+          <w:sz w:val="21"/>
+        </w:rPr>
+        <w:t>，</w:t>
       </w:r>
       <w:r>
         <w:rPr>
@@ -2235,14 +2241,14 @@
           <w:color w:val="505050"/>
           <w:sz w:val="21"/>
         </w:rPr>
-        <w:t>H_{j-1}</w:t>
-      </w:r>
-      <w:r>
-        <w:rPr>
-          <w:rFonts w:ascii="SimSun" w:hAnsi="SimSun"/>
-          <w:sz w:val="21"/>
-        </w:rPr>
-        <w:t xml:space="preserve">）与右边界 </w:t>
+        <w:t>H_j</w:t>
+      </w:r>
+      <w:r>
+        <w:rPr>
+          <w:rFonts w:ascii="SimSun" w:hAnsi="SimSun"/>
+          <w:sz w:val="21"/>
+        </w:rPr>
+        <w:t xml:space="preserve">）通过特征矩阵 </w:t>
       </w:r>
       <w:r>
         <w:rPr>
@@ -2251,15 +2257,21 @@
           <w:color w:val="505050"/>
           <w:sz w:val="21"/>
         </w:rPr>
-        <w:t>j</w:t>
-      </w:r>
-      <w:r>
-        <w:rPr>
-          <w:rFonts w:ascii="SimSun" w:hAnsi="SimSun"/>
-          <w:sz w:val="21"/>
-        </w:rPr>
-        <w:t xml:space="preserve"> 处的切向场（</w:t>
-      </w:r>
+        <w:t>M_j</w:t>
+      </w:r>
+      <w:r>
+        <w:rPr>
+          <w:rFonts w:ascii="SimSun" w:hAnsi="SimSun"/>
+          <w:sz w:val="21"/>
+        </w:rPr>
+        <w:t xml:space="preserve"> 关联：</w:t>
+      </w:r>
+    </w:p>
+    <w:p>
+      <w:pPr>
+        <w:spacing w:before="120" w:after="120"/>
+        <w:jc w:val="center"/>
+      </w:pPr>
       <w:r>
         <w:rPr>
           <w:rFonts w:ascii="Times New Roman" w:hAnsi="Times New Roman"/>
@@ -2267,14 +2279,16 @@
           <w:color w:val="505050"/>
           <w:sz w:val="21"/>
         </w:rPr>
-        <w:t>E_j</w:t>
-      </w:r>
-      <w:r>
-        <w:rPr>
-          <w:rFonts w:ascii="SimSun" w:hAnsi="SimSun"/>
-          <w:sz w:val="21"/>
-        </w:rPr>
-        <w:t>，</w:t>
+        <w:t>\begin{pmatrix} E_{j-1} \\ H_{j-1} \end{pmatrix} = \begin{pmatrix} \cos\delta_j &amp; \frac{i}{\eta_j}\sin\delta_j \\ i\eta_j\sin\delta_j &amp; \cos\delta_j \end{pmatrix} \begin{pmatrix} E_j \\ H_j \end{pmatrix} = M_j \begin{pmatrix} E_j \\ H_j \end{pmatrix}</w:t>
+      </w:r>
+    </w:p>
+    <w:p>
+      <w:r>
+        <w:rPr>
+          <w:rFonts w:ascii="SimSun" w:hAnsi="SimSun"/>
+          <w:sz w:val="21"/>
+        </w:rPr>
+        <w:t xml:space="preserve">其中 </w:t>
       </w:r>
       <w:r>
         <w:rPr>
@@ -2283,14 +2297,14 @@
           <w:color w:val="505050"/>
           <w:sz w:val="21"/>
         </w:rPr>
-        <w:t>H_j</w:t>
-      </w:r>
-      <w:r>
-        <w:rPr>
-          <w:rFonts w:ascii="SimSun" w:hAnsi="SimSun"/>
-          <w:sz w:val="21"/>
-        </w:rPr>
-        <w:t xml:space="preserve">）通过特征矩阵 </w:t>
+        <w:t>\delta_j</w:t>
+      </w:r>
+      <w:r>
+        <w:rPr>
+          <w:rFonts w:ascii="SimSun" w:hAnsi="SimSun"/>
+          <w:sz w:val="21"/>
+        </w:rPr>
+        <w:t xml:space="preserve"> 为前述相位延迟，</w:t>
       </w:r>
       <w:r>
         <w:rPr>
@@ -2299,17 +2313,15 @@
           <w:color w:val="505050"/>
           <w:sz w:val="21"/>
         </w:rPr>
-        <w:t>M_j</w:t>
-      </w:r>
-      <w:r>
-        <w:rPr>
-          <w:rFonts w:ascii="SimSun" w:hAnsi="SimSun"/>
-          <w:sz w:val="21"/>
-        </w:rPr>
-        <w:t xml:space="preserve"> 关联：</w:t>
-      </w:r>
-    </w:p>
-    <w:p>
+        <w:t>\eta_j</w:t>
+      </w:r>
+      <w:r>
+        <w:rPr>
+          <w:rFonts w:ascii="SimSun" w:hAnsi="SimSun"/>
+          <w:sz w:val="21"/>
+        </w:rPr>
+        <w:t xml:space="preserve"> 为第 </w:t>
+      </w:r>
       <w:r>
         <w:rPr>
           <w:rFonts w:ascii="Times New Roman" w:hAnsi="Times New Roman"/>
@@ -2317,18 +2329,30 @@
           <w:color w:val="505050"/>
           <w:sz w:val="21"/>
         </w:rPr>
-      </w:r>
-    </w:p>
-    <w:p>
-      <w:r>
-        <w:rPr>
-          <w:rFonts w:ascii="SimSun" w:hAnsi="SimSun"/>
-          <w:sz w:val="21"/>
-        </w:rPr>
-        <w:t>\begin{pmatrix} E_{j-1} \\ H_{j-1} \end{pmatrix} = \begin{pmatrix} \cos\delta_j &amp; \frac{i}{\eta_j}\sin\delta_j \\ i\eta_j\sin\delta_j &amp; \cos\delta_j \end{pmatrix} \begin{pmatrix} E_j \\ H_j \end{pmatrix} = M_j \begin{pmatrix} E_j \\ H_j \end{pmatrix}</w:t>
-      </w:r>
-    </w:p>
-    <w:p>
+        <w:t>j</w:t>
+      </w:r>
+      <w:r>
+        <w:rPr>
+          <w:rFonts w:ascii="SimSun" w:hAnsi="SimSun"/>
+          <w:sz w:val="21"/>
+        </w:rPr>
+        <w:t xml:space="preserve"> 层介质的斜入射光学导纳。</w:t>
+      </w:r>
+    </w:p>
+    <w:p>
+      <w:r>
+        <w:rPr>
+          <w:rFonts w:ascii="SimSun" w:hAnsi="SimSun"/>
+          <w:sz w:val="21"/>
+        </w:rPr>
+        <w:t>对于 TE 偏振：</w:t>
+      </w:r>
+    </w:p>
+    <w:p>
+      <w:pPr>
+        <w:spacing w:before="120" w:after="120"/>
+        <w:jc w:val="center"/>
+      </w:pPr>
       <w:r>
         <w:rPr>
           <w:rFonts w:ascii="Times New Roman" w:hAnsi="Times New Roman"/>
@@ -2336,16 +2360,23 @@
           <w:color w:val="505050"/>
           <w:sz w:val="21"/>
         </w:rPr>
-      </w:r>
-    </w:p>
-    <w:p>
-      <w:r>
-        <w:rPr>
-          <w:rFonts w:ascii="SimSun" w:hAnsi="SimSun"/>
-          <w:sz w:val="21"/>
-        </w:rPr>
-        <w:t xml:space="preserve">其中 </w:t>
-      </w:r>
+        <w:t>\eta_{j,TE} = \tilde{n}_j \cos\theta_j</w:t>
+      </w:r>
+    </w:p>
+    <w:p>
+      <w:r>
+        <w:rPr>
+          <w:rFonts w:ascii="SimSun" w:hAnsi="SimSun"/>
+          <w:sz w:val="21"/>
+        </w:rPr>
+        <w:t>对于 TM 偏振：</w:t>
+      </w:r>
+    </w:p>
+    <w:p>
+      <w:pPr>
+        <w:spacing w:before="120" w:after="120"/>
+        <w:jc w:val="center"/>
+      </w:pPr>
       <w:r>
         <w:rPr>
           <w:rFonts w:ascii="Times New Roman" w:hAnsi="Times New Roman"/>
@@ -2353,14 +2384,30 @@
           <w:color w:val="505050"/>
           <w:sz w:val="21"/>
         </w:rPr>
-        <w:t>\delta_j</w:t>
-      </w:r>
-      <w:r>
-        <w:rPr>
-          <w:rFonts w:ascii="SimSun" w:hAnsi="SimSun"/>
-          <w:sz w:val="21"/>
-        </w:rPr>
-        <w:t xml:space="preserve"> 为前述相位延迟，</w:t>
+        <w:t>\eta_{j,TM} = \frac{\tilde{n}_j}{\cos\theta_j}</w:t>
+      </w:r>
+    </w:p>
+    <w:p>
+      <w:pPr>
+        <w:keepNext/>
+        <w:spacing w:before="80" w:after="40"/>
+      </w:pPr>
+      <w:r>
+        <w:rPr>
+          <w:rFonts w:ascii="SimHei" w:hAnsi="SimHei"/>
+          <w:b/>
+          <w:sz w:val="21"/>
+        </w:rPr>
+        <w:t>2.2.2 多层膜总矩阵</w:t>
+      </w:r>
+    </w:p>
+    <w:p>
+      <w:r>
+        <w:rPr>
+          <w:rFonts w:ascii="SimSun" w:hAnsi="SimSun"/>
+          <w:sz w:val="21"/>
+        </w:rPr>
+        <w:t xml:space="preserve">当系统由 </w:t>
       </w:r>
       <w:r>
         <w:rPr>
@@ -2369,14 +2416,14 @@
           <w:color w:val="505050"/>
           <w:sz w:val="21"/>
         </w:rPr>
-        <w:t>\eta_j</w:t>
-      </w:r>
-      <w:r>
-        <w:rPr>
-          <w:rFonts w:ascii="SimSun" w:hAnsi="SimSun"/>
-          <w:sz w:val="21"/>
-        </w:rPr>
-        <w:t xml:space="preserve"> 为第 </w:t>
+        <w:t>N</w:t>
+      </w:r>
+      <w:r>
+        <w:rPr>
+          <w:rFonts w:ascii="SimSun" w:hAnsi="SimSun"/>
+          <w:sz w:val="21"/>
+        </w:rPr>
+        <w:t xml:space="preserve"> 层平面介质堆叠组成时，通过连续性边界条件将各层界面的特征矩阵依次级联，即可得到整个系统的总传输特征矩阵 </w:t>
       </w:r>
       <w:r>
         <w:rPr>
@@ -2385,26 +2432,21 @@
           <w:color w:val="505050"/>
           <w:sz w:val="21"/>
         </w:rPr>
-        <w:t>j</w:t>
-      </w:r>
-      <w:r>
-        <w:rPr>
-          <w:rFonts w:ascii="SimSun" w:hAnsi="SimSun"/>
-          <w:sz w:val="21"/>
-        </w:rPr>
-        <w:t xml:space="preserve"> 层介质的斜入射光学导纳。</w:t>
-      </w:r>
-    </w:p>
-    <w:p>
-      <w:r>
-        <w:rPr>
-          <w:rFonts w:ascii="SimSun" w:hAnsi="SimSun"/>
-          <w:sz w:val="21"/>
-        </w:rPr>
-        <w:t>对于 TE 偏振：</w:t>
-      </w:r>
-    </w:p>
-    <w:p>
+        <w:t>M</w:t>
+      </w:r>
+      <w:r>
+        <w:rPr>
+          <w:rFonts w:ascii="SimSun" w:hAnsi="SimSun"/>
+          <w:sz w:val="21"/>
+        </w:rPr>
+        <w:t>：</w:t>
+      </w:r>
+    </w:p>
+    <w:p>
+      <w:pPr>
+        <w:spacing w:before="120" w:after="120"/>
+        <w:jc w:val="center"/>
+      </w:pPr>
       <w:r>
         <w:rPr>
           <w:rFonts w:ascii="Times New Roman" w:hAnsi="Times New Roman"/>
@@ -2412,18 +2454,31 @@
           <w:color w:val="505050"/>
           <w:sz w:val="21"/>
         </w:rPr>
-      </w:r>
-    </w:p>
-    <w:p>
-      <w:r>
-        <w:rPr>
-          <w:rFonts w:ascii="SimSun" w:hAnsi="SimSun"/>
-          <w:sz w:val="21"/>
-        </w:rPr>
-        <w:t>\eta_{j,TE} = \tilde{n}_j \cos\theta_j</w:t>
-      </w:r>
-    </w:p>
-    <w:p>
+        <w:t>M = \prod_{j=1}^{N} M_j = M_1 M_2 \cdots M_N = \begin{pmatrix} m_{11} &amp; m_{12} \\ m_{21} &amp; m_{22} \end{pmatrix}</w:t>
+      </w:r>
+    </w:p>
+    <w:p>
+      <w:pPr>
+        <w:keepNext/>
+        <w:spacing w:before="80" w:after="40"/>
+      </w:pPr>
+      <w:r>
+        <w:rPr>
+          <w:rFonts w:ascii="SimHei" w:hAnsi="SimHei"/>
+          <w:b/>
+          <w:sz w:val="21"/>
+        </w:rPr>
+        <w:t>2.2.3 反射率、透射率、吸收率计算</w:t>
+      </w:r>
+    </w:p>
+    <w:p>
+      <w:r>
+        <w:rPr>
+          <w:rFonts w:ascii="SimSun" w:hAnsi="SimSun"/>
+          <w:sz w:val="21"/>
+        </w:rPr>
+        <w:t xml:space="preserve">设入射介质的光学导纳为 </w:t>
+      </w:r>
       <w:r>
         <w:rPr>
           <w:rFonts w:ascii="Times New Roman" w:hAnsi="Times New Roman"/>
@@ -2431,18 +2486,15 @@
           <w:color w:val="505050"/>
           <w:sz w:val="21"/>
         </w:rPr>
-      </w:r>
-    </w:p>
-    <w:p>
-      <w:r>
-        <w:rPr>
-          <w:rFonts w:ascii="SimSun" w:hAnsi="SimSun"/>
-          <w:sz w:val="21"/>
-        </w:rPr>
-        <w:t>对于 TM 偏振：</w:t>
-      </w:r>
-    </w:p>
-    <w:p>
+        <w:t>\eta_0</w:t>
+      </w:r>
+      <w:r>
+        <w:rPr>
+          <w:rFonts w:ascii="SimSun" w:hAnsi="SimSun"/>
+          <w:sz w:val="21"/>
+        </w:rPr>
+        <w:t xml:space="preserve">，基底介质的光学导纳为 </w:t>
+      </w:r>
       <w:r>
         <w:rPr>
           <w:rFonts w:ascii="Times New Roman" w:hAnsi="Times New Roman"/>
@@ -2450,18 +2502,15 @@
           <w:color w:val="505050"/>
           <w:sz w:val="21"/>
         </w:rPr>
-      </w:r>
-    </w:p>
-    <w:p>
-      <w:r>
-        <w:rPr>
-          <w:rFonts w:ascii="SimSun" w:hAnsi="SimSun"/>
-          <w:sz w:val="21"/>
-        </w:rPr>
-        <w:t>\eta_{j,TM} = \frac{\tilde{n}_j}{\cos\theta_j}</w:t>
-      </w:r>
-    </w:p>
-    <w:p>
+        <w:t>\eta_s</w:t>
+      </w:r>
+      <w:r>
+        <w:rPr>
+          <w:rFonts w:ascii="SimSun" w:hAnsi="SimSun"/>
+          <w:sz w:val="21"/>
+        </w:rPr>
+        <w:t xml:space="preserve">。振幅反射系数 </w:t>
+      </w:r>
       <w:r>
         <w:rPr>
           <w:rFonts w:ascii="Times New Roman" w:hAnsi="Times New Roman"/>
@@ -2469,29 +2518,14 @@
           <w:color w:val="505050"/>
           <w:sz w:val="21"/>
         </w:rPr>
-      </w:r>
-    </w:p>
-    <w:p>
-      <w:pPr>
-        <w:keepNext/>
-        <w:spacing w:before="80" w:after="40"/>
-      </w:pPr>
-      <w:r>
-        <w:rPr>
-          <w:rFonts w:ascii="SimHei" w:hAnsi="SimHei"/>
-          <w:b/>
-          <w:sz w:val="21"/>
-        </w:rPr>
-        <w:t>2.2.2 多层膜总矩阵</w:t>
-      </w:r>
-    </w:p>
-    <w:p>
-      <w:r>
-        <w:rPr>
-          <w:rFonts w:ascii="SimSun" w:hAnsi="SimSun"/>
-          <w:sz w:val="21"/>
-        </w:rPr>
-        <w:t xml:space="preserve">当系统由 </w:t>
+        <w:t>r</w:t>
+      </w:r>
+      <w:r>
+        <w:rPr>
+          <w:rFonts w:ascii="SimSun" w:hAnsi="SimSun"/>
+          <w:sz w:val="21"/>
+        </w:rPr>
+        <w:t xml:space="preserve"> 和振幅透射系数 </w:t>
       </w:r>
       <w:r>
         <w:rPr>
@@ -2500,15 +2534,21 @@
           <w:color w:val="505050"/>
           <w:sz w:val="21"/>
         </w:rPr>
-        <w:t>N</w:t>
-      </w:r>
-      <w:r>
-        <w:rPr>
-          <w:rFonts w:ascii="SimSun" w:hAnsi="SimSun"/>
-          <w:sz w:val="21"/>
-        </w:rPr>
-        <w:t xml:space="preserve"> 层平面介质堆叠组成时，通过连续性边界条件将各层界面的特征矩阵依次级联，即可得到整个系统的总传输特征矩阵 </w:t>
-      </w:r>
+        <w:t>t</w:t>
+      </w:r>
+      <w:r>
+        <w:rPr>
+          <w:rFonts w:ascii="SimSun" w:hAnsi="SimSun"/>
+          <w:sz w:val="21"/>
+        </w:rPr>
+        <w:t xml:space="preserve"> 可由下式计算：</w:t>
+      </w:r>
+    </w:p>
+    <w:p>
+      <w:pPr>
+        <w:spacing w:before="120" w:after="120"/>
+        <w:jc w:val="center"/>
+      </w:pPr>
       <w:r>
         <w:rPr>
           <w:rFonts w:ascii="Times New Roman" w:hAnsi="Times New Roman"/>
@@ -2516,17 +2556,14 @@
           <w:color w:val="505050"/>
           <w:sz w:val="21"/>
         </w:rPr>
-        <w:t>M</w:t>
-      </w:r>
-      <w:r>
-        <w:rPr>
-          <w:rFonts w:ascii="SimSun" w:hAnsi="SimSun"/>
-          <w:sz w:val="21"/>
-        </w:rPr>
-        <w:t>：</w:t>
-      </w:r>
-    </w:p>
-    <w:p>
+        <w:t>r = \frac{\eta_0 (m_{11} + \eta_s m_{12}) - (m_{21} + \eta_s m_{22})}{\eta_0 (m_{11} + \eta_s m_{12}) + (m_{21} + \eta_s m_{22})}</w:t>
+      </w:r>
+    </w:p>
+    <w:p>
+      <w:pPr>
+        <w:spacing w:before="120" w:after="120"/>
+        <w:jc w:val="center"/>
+      </w:pPr>
       <w:r>
         <w:rPr>
           <w:rFonts w:ascii="Times New Roman" w:hAnsi="Times New Roman"/>
@@ -2534,18 +2571,17 @@
           <w:color w:val="505050"/>
           <w:sz w:val="21"/>
         </w:rPr>
-      </w:r>
-    </w:p>
-    <w:p>
-      <w:r>
-        <w:rPr>
-          <w:rFonts w:ascii="SimSun" w:hAnsi="SimSun"/>
-          <w:sz w:val="21"/>
-        </w:rPr>
-        <w:t>M = \prod_{j=1}^{N} M_j = M_1 M_2 \cdots M_N = \begin{pmatrix} m_{11} &amp; m_{12} \\ m_{21} &amp; m_{22} \end{pmatrix}</w:t>
-      </w:r>
-    </w:p>
-    <w:p>
+        <w:t>t = \frac{2\eta_0}{\eta_0 (m_{11} + \eta_s m_{12}) + (m_{21} + \eta_s m_{22})}</w:t>
+      </w:r>
+    </w:p>
+    <w:p>
+      <w:r>
+        <w:rPr>
+          <w:rFonts w:ascii="SimSun" w:hAnsi="SimSun"/>
+          <w:sz w:val="21"/>
+        </w:rPr>
+        <w:t xml:space="preserve">由此可计算出反射率 </w:t>
+      </w:r>
       <w:r>
         <w:rPr>
           <w:rFonts w:ascii="Times New Roman" w:hAnsi="Times New Roman"/>
@@ -2553,29 +2589,14 @@
           <w:color w:val="505050"/>
           <w:sz w:val="21"/>
         </w:rPr>
-      </w:r>
-    </w:p>
-    <w:p>
-      <w:pPr>
-        <w:keepNext/>
-        <w:spacing w:before="80" w:after="40"/>
-      </w:pPr>
-      <w:r>
-        <w:rPr>
-          <w:rFonts w:ascii="SimHei" w:hAnsi="SimHei"/>
-          <w:b/>
-          <w:sz w:val="21"/>
-        </w:rPr>
-        <w:t>2.2.3 反射率、透射率、吸收率计算</w:t>
-      </w:r>
-    </w:p>
-    <w:p>
-      <w:r>
-        <w:rPr>
-          <w:rFonts w:ascii="SimSun" w:hAnsi="SimSun"/>
-          <w:sz w:val="21"/>
-        </w:rPr>
-        <w:t xml:space="preserve">设入射介质的光学导纳为 </w:t>
+        <w:t>R</w:t>
+      </w:r>
+      <w:r>
+        <w:rPr>
+          <w:rFonts w:ascii="SimSun" w:hAnsi="SimSun"/>
+          <w:sz w:val="21"/>
+        </w:rPr>
+        <w:t xml:space="preserve">、透射率 </w:t>
       </w:r>
       <w:r>
         <w:rPr>
@@ -2584,14 +2605,14 @@
           <w:color w:val="505050"/>
           <w:sz w:val="21"/>
         </w:rPr>
-        <w:t>\eta_0</w:t>
-      </w:r>
-      <w:r>
-        <w:rPr>
-          <w:rFonts w:ascii="SimSun" w:hAnsi="SimSun"/>
-          <w:sz w:val="21"/>
-        </w:rPr>
-        <w:t xml:space="preserve">，基底介质的光学导纳为 </w:t>
+        <w:t>T</w:t>
+      </w:r>
+      <w:r>
+        <w:rPr>
+          <w:rFonts w:ascii="SimSun" w:hAnsi="SimSun"/>
+          <w:sz w:val="21"/>
+        </w:rPr>
+        <w:t xml:space="preserve"> 和吸收率 </w:t>
       </w:r>
       <w:r>
         <w:rPr>
@@ -2600,15 +2621,21 @@
           <w:color w:val="505050"/>
           <w:sz w:val="21"/>
         </w:rPr>
-        <w:t>\eta_s</w:t>
-      </w:r>
-      <w:r>
-        <w:rPr>
-          <w:rFonts w:ascii="SimSun" w:hAnsi="SimSun"/>
-          <w:sz w:val="21"/>
-        </w:rPr>
-        <w:t xml:space="preserve">。振幅反射系数 </w:t>
-      </w:r>
+        <w:t>A</w:t>
+      </w:r>
+      <w:r>
+        <w:rPr>
+          <w:rFonts w:ascii="SimSun" w:hAnsi="SimSun"/>
+          <w:sz w:val="21"/>
+        </w:rPr>
+        <w:t>：</w:t>
+      </w:r>
+    </w:p>
+    <w:p>
+      <w:pPr>
+        <w:spacing w:before="120" w:after="120"/>
+        <w:jc w:val="center"/>
+      </w:pPr>
       <w:r>
         <w:rPr>
           <w:rFonts w:ascii="Times New Roman" w:hAnsi="Times New Roman"/>
@@ -2616,15 +2643,14 @@
           <w:color w:val="505050"/>
           <w:sz w:val="21"/>
         </w:rPr>
-        <w:t>r</w:t>
-      </w:r>
-      <w:r>
-        <w:rPr>
-          <w:rFonts w:ascii="SimSun" w:hAnsi="SimSun"/>
-          <w:sz w:val="21"/>
-        </w:rPr>
-        <w:t xml:space="preserve"> 和振幅透射系数 </w:t>
-      </w:r>
+        <w:t>R = |r|^2</w:t>
+      </w:r>
+    </w:p>
+    <w:p>
+      <w:pPr>
+        <w:spacing w:before="120" w:after="120"/>
+        <w:jc w:val="center"/>
+      </w:pPr>
       <w:r>
         <w:rPr>
           <w:rFonts w:ascii="Times New Roman" w:hAnsi="Times New Roman"/>
@@ -2632,17 +2658,14 @@
           <w:color w:val="505050"/>
           <w:sz w:val="21"/>
         </w:rPr>
-        <w:t>t</w:t>
-      </w:r>
-      <w:r>
-        <w:rPr>
-          <w:rFonts w:ascii="SimSun" w:hAnsi="SimSun"/>
-          <w:sz w:val="21"/>
-        </w:rPr>
-        <w:t xml:space="preserve"> 可由下式计算：</w:t>
-      </w:r>
-    </w:p>
-    <w:p>
+        <w:t>T = \frac{\text{Re}(\eta_s)}{\text{Re}(\eta_0)} |t|^2</w:t>
+      </w:r>
+    </w:p>
+    <w:p>
+      <w:pPr>
+        <w:spacing w:before="120" w:after="120"/>
+        <w:jc w:val="center"/>
+      </w:pPr>
       <w:r>
         <w:rPr>
           <w:rFonts w:ascii="Times New Roman" w:hAnsi="Times New Roman"/>
@@ -2650,18 +2673,31 @@
           <w:color w:val="505050"/>
           <w:sz w:val="21"/>
         </w:rPr>
-      </w:r>
-    </w:p>
-    <w:p>
-      <w:r>
-        <w:rPr>
-          <w:rFonts w:ascii="SimSun" w:hAnsi="SimSun"/>
-          <w:sz w:val="21"/>
-        </w:rPr>
-        <w:t>r = \frac{\eta_0 (m_{11} + \eta_s m_{12}) - (m_{21} + \eta_s m_{22})}{\eta_0 (m_{11} + \eta_s m_{12}) + (m_{21} + \eta_s m_{22})}</w:t>
-      </w:r>
-    </w:p>
-    <w:p>
+        <w:t>A = 1 - R - T</w:t>
+      </w:r>
+    </w:p>
+    <w:p>
+      <w:pPr>
+        <w:keepNext/>
+        <w:spacing w:before="80" w:after="40"/>
+      </w:pPr>
+      <w:r>
+        <w:rPr>
+          <w:rFonts w:ascii="SimHei" w:hAnsi="SimHei"/>
+          <w:b/>
+          <w:sz w:val="21"/>
+        </w:rPr>
+        <w:t>2.2.4 TE/TM 偏振差异</w:t>
+      </w:r>
+    </w:p>
+    <w:p>
+      <w:r>
+        <w:rPr>
+          <w:rFonts w:ascii="SimSun" w:hAnsi="SimSun"/>
+          <w:sz w:val="21"/>
+        </w:rPr>
+        <w:t xml:space="preserve">斜入射时（入射角 </w:t>
+      </w:r>
       <w:r>
         <w:rPr>
           <w:rFonts w:ascii="Times New Roman" w:hAnsi="Times New Roman"/>
@@ -2669,9 +2705,15 @@
           <w:color w:val="505050"/>
           <w:sz w:val="21"/>
         </w:rPr>
-      </w:r>
-    </w:p>
-    <w:p>
+        <w:t>\theta_0 &gt; 0</w:t>
+      </w:r>
+      <w:r>
+        <w:rPr>
+          <w:rFonts w:ascii="SimSun" w:hAnsi="SimSun"/>
+          <w:sz w:val="21"/>
+        </w:rPr>
+        <w:t xml:space="preserve">），由于 TE 和 TM 偏振对应的光学导纳 </w:t>
+      </w:r>
       <w:r>
         <w:rPr>
           <w:rFonts w:ascii="Times New Roman" w:hAnsi="Times New Roman"/>
@@ -2679,18 +2721,15 @@
           <w:color w:val="505050"/>
           <w:sz w:val="21"/>
         </w:rPr>
-      </w:r>
-    </w:p>
-    <w:p>
-      <w:r>
-        <w:rPr>
-          <w:rFonts w:ascii="SimSun" w:hAnsi="SimSun"/>
-          <w:sz w:val="21"/>
-        </w:rPr>
-        <w:t>t = \frac{2\eta_0}{\eta_0 (m_{11} + \eta_s m_{12}) + (m_{21} + \eta_s m_{22})}</w:t>
-      </w:r>
-    </w:p>
-    <w:p>
+        <w:t>\eta_j</w:t>
+      </w:r>
+      <w:r>
+        <w:rPr>
+          <w:rFonts w:ascii="SimSun" w:hAnsi="SimSun"/>
+          <w:sz w:val="21"/>
+        </w:rPr>
+        <w:t xml:space="preserve"> 的物理定义不同（TE 正比于 </w:t>
+      </w:r>
       <w:r>
         <w:rPr>
           <w:rFonts w:ascii="Times New Roman" w:hAnsi="Times New Roman"/>
@@ -2698,15 +2737,14 @@
           <w:color w:val="505050"/>
           <w:sz w:val="21"/>
         </w:rPr>
-      </w:r>
-    </w:p>
-    <w:p>
-      <w:r>
-        <w:rPr>
-          <w:rFonts w:ascii="SimSun" w:hAnsi="SimSun"/>
-          <w:sz w:val="21"/>
-        </w:rPr>
-        <w:t xml:space="preserve">由此可计算出反射率 </w:t>
+        <w:t>\cos\theta_j</w:t>
+      </w:r>
+      <w:r>
+        <w:rPr>
+          <w:rFonts w:ascii="SimSun" w:hAnsi="SimSun"/>
+          <w:sz w:val="21"/>
+        </w:rPr>
+        <w:t xml:space="preserve">，TM 反比于 </w:t>
       </w:r>
       <w:r>
         <w:rPr>
@@ -2715,14 +2753,37 @@
           <w:color w:val="505050"/>
           <w:sz w:val="21"/>
         </w:rPr>
-        <w:t>R</w:t>
-      </w:r>
-      <w:r>
-        <w:rPr>
-          <w:rFonts w:ascii="SimSun" w:hAnsi="SimSun"/>
-          <w:sz w:val="21"/>
-        </w:rPr>
-        <w:t xml:space="preserve">、透射率 </w:t>
+        <w:t>\cos\theta_j</w:t>
+      </w:r>
+      <w:r>
+        <w:rPr>
+          <w:rFonts w:ascii="SimSun" w:hAnsi="SimSun"/>
+          <w:sz w:val="21"/>
+        </w:rPr>
+        <w:t>），这导致了光谱透射和反射在两种极化状态下表现出各向异性，例如在特定入射角（如布儒斯特角）下 TM 偏振反射率会发生急剧衰减甚至归零。</w:t>
+      </w:r>
+    </w:p>
+    <w:p>
+      <w:pPr>
+        <w:keepNext/>
+        <w:spacing w:before="80" w:after="40"/>
+      </w:pPr>
+      <w:r>
+        <w:rPr>
+          <w:rFonts w:ascii="SimHei" w:hAnsi="SimHei"/>
+          <w:b/>
+          <w:sz w:val="21"/>
+        </w:rPr>
+        <w:t>2.2.5 腔内电场分布计算</w:t>
+      </w:r>
+    </w:p>
+    <w:p>
+      <w:r>
+        <w:rPr>
+          <w:rFonts w:ascii="SimSun" w:hAnsi="SimSun"/>
+          <w:sz w:val="21"/>
+        </w:rPr>
+        <w:t xml:space="preserve">在计算出各界面的总反射系数和透射系数后，可以通过一维反向递推，计算出多层膜内部每一层不同深度 </w:t>
       </w:r>
       <w:r>
         <w:rPr>
@@ -2731,14 +2792,14 @@
           <w:color w:val="505050"/>
           <w:sz w:val="21"/>
         </w:rPr>
-        <w:t>T</w:t>
-      </w:r>
-      <w:r>
-        <w:rPr>
-          <w:rFonts w:ascii="SimSun" w:hAnsi="SimSun"/>
-          <w:sz w:val="21"/>
-        </w:rPr>
-        <w:t xml:space="preserve"> 和吸收率 </w:t>
+        <w:t>z</w:t>
+      </w:r>
+      <w:r>
+        <w:rPr>
+          <w:rFonts w:ascii="SimSun" w:hAnsi="SimSun"/>
+          <w:sz w:val="21"/>
+        </w:rPr>
+        <w:t xml:space="preserve"> 处的正向波和反向反射波的相干叠加场强。内部第 </w:t>
       </w:r>
       <w:r>
         <w:rPr>
@@ -2747,17 +2808,15 @@
           <w:color w:val="505050"/>
           <w:sz w:val="21"/>
         </w:rPr>
-        <w:t>A</w:t>
-      </w:r>
-      <w:r>
-        <w:rPr>
-          <w:rFonts w:ascii="SimSun" w:hAnsi="SimSun"/>
-          <w:sz w:val="21"/>
-        </w:rPr>
-        <w:t>：</w:t>
-      </w:r>
-    </w:p>
-    <w:p>
+        <w:t>j</w:t>
+      </w:r>
+      <w:r>
+        <w:rPr>
+          <w:rFonts w:ascii="SimSun" w:hAnsi="SimSun"/>
+          <w:sz w:val="21"/>
+        </w:rPr>
+        <w:t xml:space="preserve"> 层深度为 </w:t>
+      </w:r>
       <w:r>
         <w:rPr>
           <w:rFonts w:ascii="Times New Roman" w:hAnsi="Times New Roman"/>
@@ -2765,18 +2824,21 @@
           <w:color w:val="505050"/>
           <w:sz w:val="21"/>
         </w:rPr>
-      </w:r>
-    </w:p>
-    <w:p>
-      <w:r>
-        <w:rPr>
-          <w:rFonts w:ascii="SimSun" w:hAnsi="SimSun"/>
-          <w:sz w:val="21"/>
-        </w:rPr>
-        <w:t>R = |r|^2</w:t>
-      </w:r>
-    </w:p>
-    <w:p>
+        <w:t>z'</w:t>
+      </w:r>
+      <w:r>
+        <w:rPr>
+          <w:rFonts w:ascii="SimSun" w:hAnsi="SimSun"/>
+          <w:sz w:val="21"/>
+        </w:rPr>
+        <w:t xml:space="preserve"> 处的电场驻波分布可描述为正向与反向传输电磁分量的干涉：</w:t>
+      </w:r>
+    </w:p>
+    <w:p>
+      <w:pPr>
+        <w:spacing w:before="120" w:after="120"/>
+        <w:jc w:val="center"/>
+      </w:pPr>
       <w:r>
         <w:rPr>
           <w:rFonts w:ascii="Times New Roman" w:hAnsi="Times New Roman"/>
@@ -2784,251 +2846,7 @@
           <w:color w:val="505050"/>
           <w:sz w:val="21"/>
         </w:rPr>
-      </w:r>
-    </w:p>
-    <w:p>
-      <w:r>
-        <w:rPr>
-          <w:rFonts w:ascii="Times New Roman" w:hAnsi="Times New Roman"/>
-          <w:i/>
-          <w:color w:val="505050"/>
-          <w:sz w:val="21"/>
-        </w:rPr>
-      </w:r>
-    </w:p>
-    <w:p>
-      <w:r>
-        <w:rPr>
-          <w:rFonts w:ascii="SimSun" w:hAnsi="SimSun"/>
-          <w:sz w:val="21"/>
-        </w:rPr>
-        <w:t>T = \frac{\text{Re}(\eta_s)}{\text{Re}(\eta_0)} |t|^2</w:t>
-      </w:r>
-    </w:p>
-    <w:p>
-      <w:r>
-        <w:rPr>
-          <w:rFonts w:ascii="Times New Roman" w:hAnsi="Times New Roman"/>
-          <w:i/>
-          <w:color w:val="505050"/>
-          <w:sz w:val="21"/>
-        </w:rPr>
-      </w:r>
-    </w:p>
-    <w:p>
-      <w:r>
-        <w:rPr>
-          <w:rFonts w:ascii="Times New Roman" w:hAnsi="Times New Roman"/>
-          <w:i/>
-          <w:color w:val="505050"/>
-          <w:sz w:val="21"/>
-        </w:rPr>
-      </w:r>
-    </w:p>
-    <w:p>
-      <w:r>
-        <w:rPr>
-          <w:rFonts w:ascii="SimSun" w:hAnsi="SimSun"/>
-          <w:sz w:val="21"/>
-        </w:rPr>
-        <w:t>A = 1 - R - T</w:t>
-      </w:r>
-    </w:p>
-    <w:p>
-      <w:r>
-        <w:rPr>
-          <w:rFonts w:ascii="Times New Roman" w:hAnsi="Times New Roman"/>
-          <w:i/>
-          <w:color w:val="505050"/>
-          <w:sz w:val="21"/>
-        </w:rPr>
-      </w:r>
-    </w:p>
-    <w:p>
-      <w:pPr>
-        <w:keepNext/>
-        <w:spacing w:before="80" w:after="40"/>
-      </w:pPr>
-      <w:r>
-        <w:rPr>
-          <w:rFonts w:ascii="SimHei" w:hAnsi="SimHei"/>
-          <w:b/>
-          <w:sz w:val="21"/>
-        </w:rPr>
-        <w:t>2.2.4 TE/TM 偏振差异</w:t>
-      </w:r>
-    </w:p>
-    <w:p>
-      <w:r>
-        <w:rPr>
-          <w:rFonts w:ascii="SimSun" w:hAnsi="SimSun"/>
-          <w:sz w:val="21"/>
-        </w:rPr>
-        <w:t xml:space="preserve">斜入射时（入射角 </w:t>
-      </w:r>
-      <w:r>
-        <w:rPr>
-          <w:rFonts w:ascii="Times New Roman" w:hAnsi="Times New Roman"/>
-          <w:i/>
-          <w:color w:val="505050"/>
-          <w:sz w:val="21"/>
-        </w:rPr>
-        <w:t>\theta_0 &gt; 0</w:t>
-      </w:r>
-      <w:r>
-        <w:rPr>
-          <w:rFonts w:ascii="SimSun" w:hAnsi="SimSun"/>
-          <w:sz w:val="21"/>
-        </w:rPr>
-        <w:t xml:space="preserve">），由于 TE 和 TM 偏振对应的光学导纳 </w:t>
-      </w:r>
-      <w:r>
-        <w:rPr>
-          <w:rFonts w:ascii="Times New Roman" w:hAnsi="Times New Roman"/>
-          <w:i/>
-          <w:color w:val="505050"/>
-          <w:sz w:val="21"/>
-        </w:rPr>
-        <w:t>\eta_j</w:t>
-      </w:r>
-      <w:r>
-        <w:rPr>
-          <w:rFonts w:ascii="SimSun" w:hAnsi="SimSun"/>
-          <w:sz w:val="21"/>
-        </w:rPr>
-        <w:t xml:space="preserve"> 的物理定义不同（TE 正比于 </w:t>
-      </w:r>
-      <w:r>
-        <w:rPr>
-          <w:rFonts w:ascii="Times New Roman" w:hAnsi="Times New Roman"/>
-          <w:i/>
-          <w:color w:val="505050"/>
-          <w:sz w:val="21"/>
-        </w:rPr>
-        <w:t>\cos\theta_j</w:t>
-      </w:r>
-      <w:r>
-        <w:rPr>
-          <w:rFonts w:ascii="SimSun" w:hAnsi="SimSun"/>
-          <w:sz w:val="21"/>
-        </w:rPr>
-        <w:t xml:space="preserve">，TM 反比于 </w:t>
-      </w:r>
-      <w:r>
-        <w:rPr>
-          <w:rFonts w:ascii="Times New Roman" w:hAnsi="Times New Roman"/>
-          <w:i/>
-          <w:color w:val="505050"/>
-          <w:sz w:val="21"/>
-        </w:rPr>
-        <w:t>\cos\theta_j</w:t>
-      </w:r>
-      <w:r>
-        <w:rPr>
-          <w:rFonts w:ascii="SimSun" w:hAnsi="SimSun"/>
-          <w:sz w:val="21"/>
-        </w:rPr>
-        <w:t>），这导致了光谱透射和反射在两种极化状态下表现出各向异性，例如在特定入射角（如布儒斯特角）下 TM 偏振反射率会发生急剧衰减甚至归零。</w:t>
-      </w:r>
-    </w:p>
-    <w:p>
-      <w:pPr>
-        <w:keepNext/>
-        <w:spacing w:before="80" w:after="40"/>
-      </w:pPr>
-      <w:r>
-        <w:rPr>
-          <w:rFonts w:ascii="SimHei" w:hAnsi="SimHei"/>
-          <w:b/>
-          <w:sz w:val="21"/>
-        </w:rPr>
-        <w:t>2.2.5 腔内电场分布计算</w:t>
-      </w:r>
-    </w:p>
-    <w:p>
-      <w:r>
-        <w:rPr>
-          <w:rFonts w:ascii="SimSun" w:hAnsi="SimSun"/>
-          <w:sz w:val="21"/>
-        </w:rPr>
-        <w:t xml:space="preserve">在计算出各界面的总反射系数和透射系数后，可以通过一维反向递推，计算出多层膜内部每一层不同深度 </w:t>
-      </w:r>
-      <w:r>
-        <w:rPr>
-          <w:rFonts w:ascii="Times New Roman" w:hAnsi="Times New Roman"/>
-          <w:i/>
-          <w:color w:val="505050"/>
-          <w:sz w:val="21"/>
-        </w:rPr>
-        <w:t>z</w:t>
-      </w:r>
-      <w:r>
-        <w:rPr>
-          <w:rFonts w:ascii="SimSun" w:hAnsi="SimSun"/>
-          <w:sz w:val="21"/>
-        </w:rPr>
-        <w:t xml:space="preserve"> 处的正向波和反向反射波的相干叠加场强。内部第 </w:t>
-      </w:r>
-      <w:r>
-        <w:rPr>
-          <w:rFonts w:ascii="Times New Roman" w:hAnsi="Times New Roman"/>
-          <w:i/>
-          <w:color w:val="505050"/>
-          <w:sz w:val="21"/>
-        </w:rPr>
-        <w:t>j</w:t>
-      </w:r>
-      <w:r>
-        <w:rPr>
-          <w:rFonts w:ascii="SimSun" w:hAnsi="SimSun"/>
-          <w:sz w:val="21"/>
-        </w:rPr>
-        <w:t xml:space="preserve"> 层深度为 </w:t>
-      </w:r>
-      <w:r>
-        <w:rPr>
-          <w:rFonts w:ascii="Times New Roman" w:hAnsi="Times New Roman"/>
-          <w:i/>
-          <w:color w:val="505050"/>
-          <w:sz w:val="21"/>
-        </w:rPr>
-        <w:t>z'</w:t>
-      </w:r>
-      <w:r>
-        <w:rPr>
-          <w:rFonts w:ascii="SimSun" w:hAnsi="SimSun"/>
-          <w:sz w:val="21"/>
-        </w:rPr>
-        <w:t xml:space="preserve"> 处的电场驻波分布可描述为正向与反向传输电磁分量的干涉：</w:t>
-      </w:r>
-    </w:p>
-    <w:p>
-      <w:r>
-        <w:rPr>
-          <w:rFonts w:ascii="Times New Roman" w:hAnsi="Times New Roman"/>
-          <w:i/>
-          <w:color w:val="505050"/>
-          <w:sz w:val="21"/>
-        </w:rPr>
-      </w:r>
-    </w:p>
-    <w:p>
-      <w:r>
-        <w:rPr>
-          <w:rFonts w:ascii="SimSun" w:hAnsi="SimSun"/>
-          <w:sz w:val="21"/>
-        </w:rPr>
         <w:t>E_j(z') = E_{j}^+ e^{-i \tilde{k}_{jz} z'} + E_{j}^- e^{i \tilde{k}_{jz} z'}</w:t>
-      </w:r>
-    </w:p>
-    <w:p>
-      <w:r>
-        <w:rPr>
-          <w:rFonts w:ascii="Times New Roman" w:hAnsi="Times New Roman"/>
-          <w:i/>
-          <w:color w:val="505050"/>
-          <w:sz w:val="21"/>
-        </w:rPr>
       </w:r>
     </w:p>
     <w:p>
@@ -3398,6 +3216,10 @@
       </w:r>
     </w:p>
     <w:p>
+      <w:pPr>
+        <w:spacing w:before="120" w:after="120"/>
+        <w:jc w:val="center"/>
+      </w:pPr>
       <w:r>
         <w:rPr>
           <w:rFonts w:ascii="Times New Roman" w:hAnsi="Times New Roman"/>
@@ -3405,18 +3227,14 @@
           <w:color w:val="505050"/>
           <w:sz w:val="21"/>
         </w:rPr>
-      </w:r>
-    </w:p>
-    <w:p>
-      <w:r>
-        <w:rPr>
-          <w:rFonts w:ascii="SimSun" w:hAnsi="SimSun"/>
-          <w:sz w:val="21"/>
-        </w:rPr>
         <w:t>n_{eff,TE}^2 = f n_{high}^2 + (1 - f) n_{low}^2</w:t>
       </w:r>
     </w:p>
     <w:p>
+      <w:pPr>
+        <w:spacing w:before="120" w:after="120"/>
+        <w:jc w:val="center"/>
+      </w:pPr>
       <w:r>
         <w:rPr>
           <w:rFonts w:ascii="Times New Roman" w:hAnsi="Times New Roman"/>
@@ -3424,9 +3242,17 @@
           <w:color w:val="505050"/>
           <w:sz w:val="21"/>
         </w:rPr>
-      </w:r>
-    </w:p>
-    <w:p>
+        <w:t>\frac{1}{n_{eff,TM}^2} = \frac{f}{n_{high}^2} + \frac{1 - f}{n_{low}^2}</w:t>
+      </w:r>
+    </w:p>
+    <w:p>
+      <w:r>
+        <w:rPr>
+          <w:rFonts w:ascii="SimSun" w:hAnsi="SimSun"/>
+          <w:sz w:val="21"/>
+        </w:rPr>
+        <w:t xml:space="preserve">其中 </w:t>
+      </w:r>
       <w:r>
         <w:rPr>
           <w:rFonts w:ascii="Times New Roman" w:hAnsi="Times New Roman"/>
@@ -3434,18 +3260,15 @@
           <w:color w:val="505050"/>
           <w:sz w:val="21"/>
         </w:rPr>
-      </w:r>
-    </w:p>
-    <w:p>
-      <w:r>
-        <w:rPr>
-          <w:rFonts w:ascii="SimSun" w:hAnsi="SimSun"/>
-          <w:sz w:val="21"/>
-        </w:rPr>
-        <w:t>\frac{1}{n_{eff,TM}^2} = \frac{f}{n_{high}^2} + \frac{1 - f}{n_{low}^2}</w:t>
-      </w:r>
-    </w:p>
-    <w:p>
+        <w:t>f</w:t>
+      </w:r>
+      <w:r>
+        <w:rPr>
+          <w:rFonts w:ascii="SimSun" w:hAnsi="SimSun"/>
+          <w:sz w:val="21"/>
+        </w:rPr>
+        <w:t xml:space="preserve"> 为高折射率材料所占的体积占空比（Fill Factor），</w:t>
+      </w:r>
       <w:r>
         <w:rPr>
           <w:rFonts w:ascii="Times New Roman" w:hAnsi="Times New Roman"/>
@@ -3453,15 +3276,14 @@
           <w:color w:val="505050"/>
           <w:sz w:val="21"/>
         </w:rPr>
-      </w:r>
-    </w:p>
-    <w:p>
-      <w:r>
-        <w:rPr>
-          <w:rFonts w:ascii="SimSun" w:hAnsi="SimSun"/>
-          <w:sz w:val="21"/>
-        </w:rPr>
-        <w:t xml:space="preserve">其中 </w:t>
+        <w:t>n_{high}</w:t>
+      </w:r>
+      <w:r>
+        <w:rPr>
+          <w:rFonts w:ascii="SimSun" w:hAnsi="SimSun"/>
+          <w:sz w:val="21"/>
+        </w:rPr>
+        <w:t xml:space="preserve"> 和 </w:t>
       </w:r>
       <w:r>
         <w:rPr>
@@ -3470,14 +3292,55 @@
           <w:color w:val="505050"/>
           <w:sz w:val="21"/>
         </w:rPr>
-        <w:t>f</w:t>
-      </w:r>
-      <w:r>
-        <w:rPr>
-          <w:rFonts w:ascii="SimSun" w:hAnsi="SimSun"/>
-          <w:sz w:val="21"/>
-        </w:rPr>
-        <w:t xml:space="preserve"> 为高折射率材料所占的体积占空比（Fill Factor），</w:t>
+        <w:t>n_{low}</w:t>
+      </w:r>
+      <w:r>
+        <w:rPr>
+          <w:rFonts w:ascii="SimSun" w:hAnsi="SimSun"/>
+          <w:sz w:val="21"/>
+        </w:rPr>
+        <w:t xml:space="preserve"> 分别为组成光栅的高、低折射率材料折射率。本平台基于此等效值，使用传输矩阵法计算单层各向异性薄膜，以演示亚波长格栅的偏振干涉特性。</w:t>
+      </w:r>
+    </w:p>
+    <w:p>
+      <w:pPr>
+        <w:keepNext/>
+        <w:spacing w:before="80" w:after="40"/>
+      </w:pPr>
+      <w:r>
+        <w:rPr>
+          <w:rFonts w:ascii="SimHei" w:hAnsi="SimHei"/>
+          <w:b/>
+          <w:sz w:val="21"/>
+        </w:rPr>
+        <w:t>2.4.3 适用边界与失效条件</w:t>
+      </w:r>
+    </w:p>
+    <w:p>
+      <w:pPr>
+        <w:spacing w:after="40"/>
+        <w:ind w:left="360"/>
+      </w:pPr>
+      <w:r>
+        <w:rPr>
+          <w:b/>
+        </w:rPr>
+        <w:t xml:space="preserve">• </w:t>
+      </w:r>
+      <w:r>
+        <w:rPr>
+          <w:rFonts w:ascii="SimSun" w:hAnsi="SimSun"/>
+          <w:b/>
+          <w:sz w:val="21"/>
+        </w:rPr>
+        <w:t>适用条件</w:t>
+      </w:r>
+      <w:r>
+        <w:rPr>
+          <w:rFonts w:ascii="SimSun" w:hAnsi="SimSun"/>
+          <w:sz w:val="21"/>
+        </w:rPr>
+        <w:t xml:space="preserve">：必须严格满足 </w:t>
       </w:r>
       <w:r>
         <w:rPr>
@@ -3486,14 +3349,14 @@
           <w:color w:val="505050"/>
           <w:sz w:val="21"/>
         </w:rPr>
-        <w:t>n_{high}</w:t>
-      </w:r>
-      <w:r>
-        <w:rPr>
-          <w:rFonts w:ascii="SimSun" w:hAnsi="SimSun"/>
-          <w:sz w:val="21"/>
-        </w:rPr>
-        <w:t xml:space="preserve"> 和 </w:t>
+        <w:t>P/\lambda \to 0</w:t>
+      </w:r>
+      <w:r>
+        <w:rPr>
+          <w:rFonts w:ascii="SimSun" w:hAnsi="SimSun"/>
+          <w:sz w:val="21"/>
+        </w:rPr>
+        <w:t xml:space="preserve">。通常在 </w:t>
       </w:r>
       <w:r>
         <w:rPr>
@@ -3502,28 +3365,14 @@
           <w:color w:val="505050"/>
           <w:sz w:val="21"/>
         </w:rPr>
-        <w:t>n_{low}</w:t>
-      </w:r>
-      <w:r>
-        <w:rPr>
-          <w:rFonts w:ascii="SimSun" w:hAnsi="SimSun"/>
-          <w:sz w:val="21"/>
-        </w:rPr>
-        <w:t xml:space="preserve"> 分别为组成光栅的高、低折射率材料折射率。本平台基于此等效值，使用传输矩阵法计算单层各向异性薄膜，以演示亚波长格栅的偏振干涉特性。</w:t>
-      </w:r>
-    </w:p>
-    <w:p>
-      <w:pPr>
-        <w:keepNext/>
-        <w:spacing w:before="80" w:after="40"/>
-      </w:pPr>
-      <w:r>
-        <w:rPr>
-          <w:rFonts w:ascii="SimHei" w:hAnsi="SimHei"/>
-          <w:b/>
-          <w:sz w:val="21"/>
-        </w:rPr>
-        <w:t>2.4.3 适用边界与失效条件</w:t>
+        <w:t>P/\lambda \le 0.1</w:t>
+      </w:r>
+      <w:r>
+        <w:rPr>
+          <w:rFonts w:ascii="SimSun" w:hAnsi="SimSun"/>
+          <w:sz w:val="21"/>
+        </w:rPr>
+        <w:t xml:space="preserve"> 时，零阶 EMT 近似与严格物理仿真有较好的一致性。</w:t>
       </w:r>
     </w:p>
     <w:p>
@@ -3543,14 +3392,14 @@
           <w:b/>
           <w:sz w:val="21"/>
         </w:rPr>
-        <w:t>适用条件</w:t>
-      </w:r>
-      <w:r>
-        <w:rPr>
-          <w:rFonts w:ascii="SimSun" w:hAnsi="SimSun"/>
-          <w:sz w:val="21"/>
-        </w:rPr>
-        <w:t xml:space="preserve">：必须严格满足 </w:t>
+        <w:t>失效条件</w:t>
+      </w:r>
+      <w:r>
+        <w:rPr>
+          <w:rFonts w:ascii="SimSun" w:hAnsi="SimSun"/>
+          <w:sz w:val="21"/>
+        </w:rPr>
+        <w:t xml:space="preserve">：当周期 </w:t>
       </w:r>
       <w:r>
         <w:rPr>
@@ -3559,14 +3408,14 @@
           <w:color w:val="505050"/>
           <w:sz w:val="21"/>
         </w:rPr>
-        <w:t>P/\lambda \to 0</w:t>
-      </w:r>
-      <w:r>
-        <w:rPr>
-          <w:rFonts w:ascii="SimSun" w:hAnsi="SimSun"/>
-          <w:sz w:val="21"/>
-        </w:rPr>
-        <w:t xml:space="preserve">。通常在 </w:t>
+        <w:t>P</w:t>
+      </w:r>
+      <w:r>
+        <w:rPr>
+          <w:rFonts w:ascii="SimSun" w:hAnsi="SimSun"/>
+          <w:sz w:val="21"/>
+        </w:rPr>
+        <w:t xml:space="preserve"> 增大，与工作波长 </w:t>
       </w:r>
       <w:r>
         <w:rPr>
@@ -3575,41 +3424,14 @@
           <w:color w:val="505050"/>
           <w:sz w:val="21"/>
         </w:rPr>
-        <w:t>P/\lambda \le 0.1</w:t>
-      </w:r>
-      <w:r>
-        <w:rPr>
-          <w:rFonts w:ascii="SimSun" w:hAnsi="SimSun"/>
-          <w:sz w:val="21"/>
-        </w:rPr>
-        <w:t xml:space="preserve"> 时，零阶 EMT 近似与严格物理仿真有较好的一致性。</w:t>
-      </w:r>
-    </w:p>
-    <w:p>
-      <w:pPr>
-        <w:spacing w:after="40"/>
-        <w:ind w:left="360"/>
-      </w:pPr>
-      <w:r>
-        <w:rPr>
-          <w:b/>
-        </w:rPr>
-        <w:t xml:space="preserve">• </w:t>
-      </w:r>
-      <w:r>
-        <w:rPr>
-          <w:rFonts w:ascii="SimSun" w:hAnsi="SimSun"/>
-          <w:b/>
-          <w:sz w:val="21"/>
-        </w:rPr>
-        <w:t>失效条件</w:t>
-      </w:r>
-      <w:r>
-        <w:rPr>
-          <w:rFonts w:ascii="SimSun" w:hAnsi="SimSun"/>
-          <w:sz w:val="21"/>
-        </w:rPr>
-        <w:t xml:space="preserve">：当周期 </w:t>
+        <w:t>\lambda</w:t>
+      </w:r>
+      <w:r>
+        <w:rPr>
+          <w:rFonts w:ascii="SimSun" w:hAnsi="SimSun"/>
+          <w:sz w:val="21"/>
+        </w:rPr>
+        <w:t xml:space="preserve"> 可比拟（例如 </w:t>
       </w:r>
       <w:r>
         <w:rPr>
@@ -3618,14 +3440,129 @@
           <w:color w:val="505050"/>
           <w:sz w:val="21"/>
         </w:rPr>
-        <w:t>P</w:t>
-      </w:r>
-      <w:r>
-        <w:rPr>
-          <w:rFonts w:ascii="SimSun" w:hAnsi="SimSun"/>
-          <w:sz w:val="21"/>
-        </w:rPr>
-        <w:t xml:space="preserve"> 增大，与工作波长 </w:t>
+        <w:t>P/\lambda \ge 0.5</w:t>
+      </w:r>
+      <w:r>
+        <w:rPr>
+          <w:rFonts w:ascii="SimSun" w:hAnsi="SimSun"/>
+          <w:sz w:val="21"/>
+        </w:rPr>
+        <w:t>）时，高阶衍射级次被激发并在结构中传播，形成明显的波导共振或衍射分支。此时零阶 EMT 物理模型不再适用，需要采用更高阶的周期结构电磁求解方法。</w:t>
+      </w:r>
+    </w:p>
+    <w:p>
+      <w:pPr>
+        <w:keepNext/>
+        <w:spacing w:before="80" w:after="40"/>
+      </w:pPr>
+      <w:r>
+        <w:rPr>
+          <w:rFonts w:ascii="SimHei" w:hAnsi="SimHei"/>
+          <w:b/>
+          <w:sz w:val="21"/>
+        </w:rPr>
+        <w:t>2.4.4 与严格 RCWA 的区别</w:t>
+      </w:r>
+    </w:p>
+    <w:p>
+      <w:r>
+        <w:rPr>
+          <w:rFonts w:ascii="SimSun" w:hAnsi="SimSun"/>
+          <w:sz w:val="21"/>
+        </w:rPr>
+        <w:t>严格耦合波分析（RCWA）通过将麦克斯韦方程在傅里叶空间展开，解算包含无数个衍射级次相互作用的矩阵特征值系统。而当前的 EMT 模块仅提取零阶有效双折射各向异性物性进行一维传输求解。</w:t>
+      </w:r>
+    </w:p>
+    <w:p>
+      <w:r>
+        <w:rPr>
+          <w:rFonts w:ascii="SimSun" w:hAnsi="SimSun"/>
+          <w:sz w:val="21"/>
+        </w:rPr>
+        <w:t>guided_grating/rcwa.py 文件名沿用了早期开发阶段的模块命名；当前 v0.2.1 版本中，该模块的物理实现边界为 EMT 近似分析，不对应严格 RCWA 算法实现。</w:t>
+      </w:r>
+    </w:p>
+    <w:p>
+      <w:pPr>
+        <w:keepNext/>
+        <w:spacing w:before="120" w:after="80"/>
+      </w:pPr>
+      <w:r>
+        <w:rPr>
+          <w:rFonts w:ascii="SimHei" w:hAnsi="SimHei"/>
+          <w:b/>
+          <w:sz w:val="22"/>
+        </w:rPr>
+        <w:t>2.5 外部仿真数据导入</w:t>
+      </w:r>
+    </w:p>
+    <w:p>
+      <w:pPr>
+        <w:keepNext/>
+        <w:spacing w:before="80" w:after="40"/>
+      </w:pPr>
+      <w:r>
+        <w:rPr>
+          <w:rFonts w:ascii="SimHei" w:hAnsi="SimHei"/>
+          <w:b/>
+          <w:sz w:val="21"/>
+        </w:rPr>
+        <w:t>2.5.1 COMSOL CSV 数据读取</w:t>
+      </w:r>
+    </w:p>
+    <w:p>
+      <w:r>
+        <w:rPr>
+          <w:rFonts w:ascii="SimSun" w:hAnsi="SimSun"/>
+          <w:sz w:val="21"/>
+        </w:rPr>
+        <w:t>为了展示偏振共振光栅等超出 EMT 近似适用范围的周期结构特性，平台设计了外部 CSV 数据解析读取管线。COMSOL 仅作为外部高精度仿真数据的来源，本平台不依赖 COMSOL 运行时或授权，可以在独立 Python 环境中完成光谱数据分析。</w:t>
+      </w:r>
+    </w:p>
+    <w:p>
+      <w:pPr>
+        <w:keepNext/>
+        <w:spacing w:before="80" w:after="40"/>
+      </w:pPr>
+      <w:r>
+        <w:rPr>
+          <w:rFonts w:ascii="SimHei" w:hAnsi="SimHei"/>
+          <w:b/>
+          <w:sz w:val="21"/>
+        </w:rPr>
+        <w:t>2.5.2 光谱特征提取</w:t>
+      </w:r>
+    </w:p>
+    <w:p>
+      <w:r>
+        <w:rPr>
+          <w:rFonts w:ascii="SimSun" w:hAnsi="SimSun"/>
+          <w:sz w:val="21"/>
+        </w:rPr>
+        <w:t>通过 Pandas 解析包含复杂表头的 CSV 数据列，算法在导入数据后自动对反射/透射曲线进行滤波和二阶导数寻找极值点，实现特征光谱信息的自动解算。</w:t>
+      </w:r>
+    </w:p>
+    <w:p>
+      <w:pPr>
+        <w:keepNext/>
+        <w:spacing w:before="80" w:after="40"/>
+      </w:pPr>
+      <w:r>
+        <w:rPr>
+          <w:rFonts w:ascii="SimHei" w:hAnsi="SimHei"/>
+          <w:b/>
+          <w:sz w:val="21"/>
+        </w:rPr>
+        <w:t>2.5.3 FWHM、Q 值、MAE 等指标</w:t>
+      </w:r>
+    </w:p>
+    <w:p>
+      <w:r>
+        <w:rPr>
+          <w:rFonts w:ascii="SimSun" w:hAnsi="SimSun"/>
+          <w:sz w:val="21"/>
+        </w:rPr>
+        <w:t xml:space="preserve">特征提取模块可自动计算共振峰在特定阈值下的半高全宽（FWHM），估算谐振腔的品质因子 </w:t>
       </w:r>
       <w:r>
         <w:rPr>
@@ -3634,14 +3571,14 @@
           <w:color w:val="505050"/>
           <w:sz w:val="21"/>
         </w:rPr>
-        <w:t>\lambda</w:t>
-      </w:r>
-      <w:r>
-        <w:rPr>
-          <w:rFonts w:ascii="SimSun" w:hAnsi="SimSun"/>
-          <w:sz w:val="21"/>
-        </w:rPr>
-        <w:t xml:space="preserve"> 可比拟（例如 </w:t>
+        <w:t>Q</w:t>
+      </w:r>
+      <w:r>
+        <w:rPr>
+          <w:rFonts w:ascii="SimSun" w:hAnsi="SimSun"/>
+          <w:sz w:val="21"/>
+        </w:rPr>
+        <w:t xml:space="preserve"> 值（定义为 </w:t>
       </w:r>
       <w:r>
         <w:rPr>
@@ -3650,46 +3587,14 @@
           <w:color w:val="505050"/>
           <w:sz w:val="21"/>
         </w:rPr>
-        <w:t>P/\lambda \ge 0.5</w:t>
-      </w:r>
-      <w:r>
-        <w:rPr>
-          <w:rFonts w:ascii="SimSun" w:hAnsi="SimSun"/>
-          <w:sz w:val="21"/>
-        </w:rPr>
-        <w:t>）时，高阶衍射级次被激发并在结构中传播，形成明显的波导共振或衍射分支。此时零阶 EMT 物理模型不再适用，需要采用更高阶的周期结构电磁求解方法。</w:t>
-      </w:r>
-    </w:p>
-    <w:p>
-      <w:pPr>
-        <w:keepNext/>
-        <w:spacing w:before="80" w:after="40"/>
-      </w:pPr>
-      <w:r>
-        <w:rPr>
-          <w:rFonts w:ascii="SimHei" w:hAnsi="SimHei"/>
-          <w:b/>
-          <w:sz w:val="21"/>
-        </w:rPr>
-        <w:t>2.4.4 与严格 RCWA 的区别</w:t>
-      </w:r>
-    </w:p>
-    <w:p>
-      <w:r>
-        <w:rPr>
-          <w:rFonts w:ascii="SimSun" w:hAnsi="SimSun"/>
-          <w:sz w:val="21"/>
-        </w:rPr>
-        <w:t>严格耦合波分析（RCWA）通过将麦克斯韦方程在傅里叶空间展开，解算包含无数个衍射级次相互作用的矩阵特征值系统。而当前的 EMT 模块仅提取零阶有效双折射各向异性物性进行一维传输求解。</w:t>
-      </w:r>
-    </w:p>
-    <w:p>
-      <w:r>
-        <w:rPr>
-          <w:rFonts w:ascii="SimSun" w:hAnsi="SimSun"/>
-          <w:sz w:val="21"/>
-        </w:rPr>
-        <w:t>guided_grating/rcwa.py 文件名沿用了早期开发阶段的模块命名；当前 v0.2.1 版本中，该模块的物理实现边界为 EMT 近似分析，不对应严格 RCWA 算法实现。</w:t>
+        <w:t>Q = \lambda_0 / FWHM</w:t>
+      </w:r>
+      <w:r>
+        <w:rPr>
+          <w:rFonts w:ascii="SimSun" w:hAnsi="SimSun"/>
+          <w:sz w:val="21"/>
+        </w:rPr>
+        <w:t>），以及计算理论曲线与测量数据之间的平均绝对误差（MAE）和均方根误差（RMSE），以此作为器件设计的参数筛选指标。</w:t>
       </w:r>
     </w:p>
     <w:p>
@@ -3701,79 +3606,48 @@
         <w:rPr>
           <w:rFonts w:ascii="SimHei" w:hAnsi="SimHei"/>
           <w:b/>
+          <w:sz w:val="24"/>
+        </w:rPr>
+        <w:t>2.6 平台底层物理方程体系</w:t>
+      </w:r>
+    </w:p>
+    <w:p>
+      <w:r>
+        <w:rPr>
+          <w:rFonts w:ascii="SimSun" w:hAnsi="SimSun"/>
+          <w:sz w:val="21"/>
+        </w:rPr>
+        <w:t>本节梳理了本平台在平面层状薄膜电磁计算及亚波长周期结构等效分析中，实际实现的底层物理方程体系。公式后的说明概括了其在仿真代码中的具体作用。</w:t>
+      </w:r>
+    </w:p>
+    <w:p>
+      <w:pPr>
+        <w:keepNext/>
+        <w:spacing w:before="120" w:after="80"/>
+      </w:pPr>
+      <w:r>
+        <w:rPr>
+          <w:rFonts w:ascii="SimHei" w:hAnsi="SimHei"/>
+          <w:b/>
           <w:sz w:val="22"/>
         </w:rPr>
-        <w:t>2.5 外部仿真数据导入</w:t>
-      </w:r>
-    </w:p>
-    <w:p>
-      <w:pPr>
-        <w:keepNext/>
-        <w:spacing w:before="80" w:after="40"/>
-      </w:pPr>
-      <w:r>
-        <w:rPr>
-          <w:rFonts w:ascii="SimHei" w:hAnsi="SimHei"/>
-          <w:b/>
-          <w:sz w:val="21"/>
-        </w:rPr>
-        <w:t>2.5.1 COMSOL CSV 数据读取</w:t>
-      </w:r>
-    </w:p>
-    <w:p>
-      <w:r>
-        <w:rPr>
-          <w:rFonts w:ascii="SimSun" w:hAnsi="SimSun"/>
-          <w:sz w:val="21"/>
-        </w:rPr>
-        <w:t>为了展示偏振共振光栅等超出 EMT 近似适用范围的周期结构特性，平台设计了外部 CSV 数据解析读取管线。COMSOL 仅作为外部高精度仿真数据的来源，本平台不依赖 COMSOL 运行时或授权，可以在独立 Python 环境中完成光谱数据分析。</w:t>
-      </w:r>
-    </w:p>
-    <w:p>
-      <w:pPr>
-        <w:keepNext/>
-        <w:spacing w:before="80" w:after="40"/>
-      </w:pPr>
-      <w:r>
-        <w:rPr>
-          <w:rFonts w:ascii="SimHei" w:hAnsi="SimHei"/>
-          <w:b/>
-          <w:sz w:val="21"/>
-        </w:rPr>
-        <w:t>2.5.2 光谱特征提取</w:t>
-      </w:r>
-    </w:p>
-    <w:p>
-      <w:r>
-        <w:rPr>
-          <w:rFonts w:ascii="SimSun" w:hAnsi="SimSun"/>
-          <w:sz w:val="21"/>
-        </w:rPr>
-        <w:t>通过 Pandas 解析包含复杂表头的 CSV 数据列，算法在导入数据后自动对反射/透射曲线进行滤波和二阶导数寻找极值点，实现特征光谱信息的自动解算。</w:t>
-      </w:r>
-    </w:p>
-    <w:p>
-      <w:pPr>
-        <w:keepNext/>
-        <w:spacing w:before="80" w:after="40"/>
-      </w:pPr>
-      <w:r>
-        <w:rPr>
-          <w:rFonts w:ascii="SimHei" w:hAnsi="SimHei"/>
-          <w:b/>
-          <w:sz w:val="21"/>
-        </w:rPr>
-        <w:t>2.5.3 FWHM、Q 值、MAE 等指标</w:t>
-      </w:r>
-    </w:p>
-    <w:p>
-      <w:r>
-        <w:rPr>
-          <w:rFonts w:ascii="SimSun" w:hAnsi="SimSun"/>
-          <w:sz w:val="21"/>
-        </w:rPr>
-        <w:t xml:space="preserve">特征提取模块可自动计算共振峰在特定阈值下的半高全宽（FWHM），估算谐振腔的品质因子 </w:t>
-      </w:r>
+        <w:t>2.6.1 麦克斯韦方程组与薄膜光学边界条件</w:t>
+      </w:r>
+    </w:p>
+    <w:p>
+      <w:r>
+        <w:rPr>
+          <w:rFonts w:ascii="SimSun" w:hAnsi="SimSun"/>
+          <w:sz w:val="21"/>
+        </w:rPr>
+        <w:t>电磁场在无源各向同性介质中的麦克斯韦旋度方程可描述平面波传播的基本规律：</w:t>
+      </w:r>
+    </w:p>
+    <w:p>
+      <w:pPr>
+        <w:spacing w:before="120" w:after="120"/>
+        <w:jc w:val="center"/>
+      </w:pPr>
       <w:r>
         <w:rPr>
           <w:rFonts w:ascii="Times New Roman" w:hAnsi="Times New Roman"/>
@@ -3781,15 +3655,32 @@
           <w:color w:val="505050"/>
           <w:sz w:val="21"/>
         </w:rPr>
-        <w:t>Q</w:t>
-      </w:r>
-      <w:r>
-        <w:rPr>
-          <w:rFonts w:ascii="SimSun" w:hAnsi="SimSun"/>
-          <w:sz w:val="21"/>
-        </w:rPr>
-        <w:t xml:space="preserve"> 值（定义为 </w:t>
-      </w:r>
+        <w:t>\nabla \times \mathbf{E} = -\mu \frac{\partial \mathbf{H}}{\partial t}, \quad \nabla \times \mathbf{H} = \epsilon \frac{\partial \mathbf{E}}{\partial t}</w:t>
+      </w:r>
+    </w:p>
+    <w:p>
+      <w:r>
+        <w:rPr>
+          <w:rFonts w:ascii="SimSun" w:hAnsi="SimSun"/>
+          <w:sz w:val="21"/>
+        </w:rPr>
+        <w:t>该方程组是波动光学和本平台薄膜仿真的根本物理源头，用于推导介质层中的简谐平面波传播形式。</w:t>
+      </w:r>
+    </w:p>
+    <w:p>
+      <w:r>
+        <w:rPr>
+          <w:rFonts w:ascii="SimSun" w:hAnsi="SimSun"/>
+          <w:sz w:val="21"/>
+        </w:rPr>
+        <w:t>在两个平整介质界面处，电场与磁场的切向分量必须连续，即满足切向连续电磁边界条件：</w:t>
+      </w:r>
+    </w:p>
+    <w:p>
+      <w:pPr>
+        <w:spacing w:before="120" w:after="120"/>
+        <w:jc w:val="center"/>
+      </w:pPr>
       <w:r>
         <w:rPr>
           <w:rFonts w:ascii="Times New Roman" w:hAnsi="Times New Roman"/>
@@ -3797,14 +3688,16 @@
           <w:color w:val="505050"/>
           <w:sz w:val="21"/>
         </w:rPr>
-        <w:t>Q = \lambda_0 / FWHM</w:t>
-      </w:r>
-      <w:r>
-        <w:rPr>
-          <w:rFonts w:ascii="SimSun" w:hAnsi="SimSun"/>
-          <w:sz w:val="21"/>
-        </w:rPr>
-        <w:t>），以及计算理论曲线与测量数据之间的平均绝对误差（MAE）和均方根误差（RMSE），以此作为器件设计的参数筛选指标。</w:t>
+        <w:t>E_{1,t} = E_{2,t}, \quad H_{1,t} = H_{2,t}</w:t>
+      </w:r>
+    </w:p>
+    <w:p>
+      <w:r>
+        <w:rPr>
+          <w:rFonts w:ascii="SimSun" w:hAnsi="SimSun"/>
+          <w:sz w:val="21"/>
+        </w:rPr>
+        <w:t>本平台传输矩阵（TMM）的核心递推关系即由该一维边界连续性条件级联而成。</w:t>
       </w:r>
     </w:p>
     <w:p>
@@ -3816,44 +3709,19 @@
         <w:rPr>
           <w:rFonts w:ascii="SimHei" w:hAnsi="SimHei"/>
           <w:b/>
-          <w:sz w:val="24"/>
-        </w:rPr>
-        <w:t>2.6 平台底层物理方程体系</w:t>
-      </w:r>
-    </w:p>
-    <w:p>
-      <w:r>
-        <w:rPr>
-          <w:rFonts w:ascii="SimSun" w:hAnsi="SimSun"/>
-          <w:sz w:val="21"/>
-        </w:rPr>
-        <w:t>本节梳理了本平台在平面层状薄膜电磁计算及亚波长周期结构等效分析中，实际实现的底层物理方程体系。公式后的说明概括了其在仿真代码中的具体作用。</w:t>
-      </w:r>
-    </w:p>
-    <w:p>
-      <w:pPr>
-        <w:keepNext/>
-        <w:spacing w:before="120" w:after="80"/>
-      </w:pPr>
-      <w:r>
-        <w:rPr>
-          <w:rFonts w:ascii="SimHei" w:hAnsi="SimHei"/>
-          <w:b/>
           <w:sz w:val="22"/>
         </w:rPr>
-        <w:t>2.6.1 麦克斯韦方程组与薄膜光学边界条件</w:t>
-      </w:r>
-    </w:p>
-    <w:p>
-      <w:r>
-        <w:rPr>
-          <w:rFonts w:ascii="SimSun" w:hAnsi="SimSun"/>
-          <w:sz w:val="21"/>
-        </w:rPr>
-        <w:t>电磁场在无源各向同性介质中的麦克斯韦旋度方程可描述平面波传播的基本规律：</w:t>
-      </w:r>
-    </w:p>
-    <w:p>
+        <w:t>2.6.2 平面波、复折射率与材料吸收</w:t>
+      </w:r>
+    </w:p>
+    <w:p>
+      <w:r>
+        <w:rPr>
+          <w:rFonts w:ascii="SimSun" w:hAnsi="SimSun"/>
+          <w:sz w:val="21"/>
+        </w:rPr>
+        <w:t xml:space="preserve">单色简谐平面波沿 </w:t>
+      </w:r>
       <w:r>
         <w:rPr>
           <w:rFonts w:ascii="Times New Roman" w:hAnsi="Times New Roman"/>
@@ -3861,18 +3729,21 @@
           <w:color w:val="505050"/>
           <w:sz w:val="21"/>
         </w:rPr>
-      </w:r>
-    </w:p>
-    <w:p>
-      <w:r>
-        <w:rPr>
-          <w:rFonts w:ascii="SimSun" w:hAnsi="SimSun"/>
-          <w:sz w:val="21"/>
-        </w:rPr>
-        <w:t>\nabla \times \mathbf{E} = -\mu \frac{\partial \mathbf{H}}{\partial t}, \quad \nabla \times \mathbf{H} = \epsilon \frac{\partial \mathbf{E}}{\partial t}</w:t>
-      </w:r>
-    </w:p>
-    <w:p>
+        <w:t>z</w:t>
+      </w:r>
+      <w:r>
+        <w:rPr>
+          <w:rFonts w:ascii="SimSun" w:hAnsi="SimSun"/>
+          <w:sz w:val="21"/>
+        </w:rPr>
+        <w:t xml:space="preserve"> 方向在一维薄膜层中传播时，电场复振幅形式为：</w:t>
+      </w:r>
+    </w:p>
+    <w:p>
+      <w:pPr>
+        <w:spacing w:before="120" w:after="120"/>
+        <w:jc w:val="center"/>
+      </w:pPr>
       <w:r>
         <w:rPr>
           <w:rFonts w:ascii="Times New Roman" w:hAnsi="Times New Roman"/>
@@ -3880,27 +3751,32 @@
           <w:color w:val="505050"/>
           <w:sz w:val="21"/>
         </w:rPr>
-      </w:r>
-    </w:p>
-    <w:p>
-      <w:r>
-        <w:rPr>
-          <w:rFonts w:ascii="SimSun" w:hAnsi="SimSun"/>
-          <w:sz w:val="21"/>
-        </w:rPr>
-        <w:t>该方程组是波动光学和本平台薄膜仿真的根本物理源头，用于推导介质层中的简谐平面波传播形式。</w:t>
-      </w:r>
-    </w:p>
-    <w:p>
-      <w:r>
-        <w:rPr>
-          <w:rFonts w:ascii="SimSun" w:hAnsi="SimSun"/>
-          <w:sz w:val="21"/>
-        </w:rPr>
-        <w:t>在两个平整介质界面处，电场与磁场的切向分量必须连续，即满足切向连续电磁边界条件：</w:t>
-      </w:r>
-    </w:p>
-    <w:p>
+        <w:t>E(z) = E_0 e^{-i k_z z}</w:t>
+      </w:r>
+    </w:p>
+    <w:p>
+      <w:r>
+        <w:rPr>
+          <w:rFonts w:ascii="SimSun" w:hAnsi="SimSun"/>
+          <w:sz w:val="21"/>
+        </w:rPr>
+        <w:t>该公式用于平台腔内电场空间分布的相位计算，是确定每一层相位延迟的理论依据。</w:t>
+      </w:r>
+    </w:p>
+    <w:p>
+      <w:r>
+        <w:rPr>
+          <w:rFonts w:ascii="SimSun" w:hAnsi="SimSun"/>
+          <w:sz w:val="21"/>
+        </w:rPr>
+        <w:t>引入复折射率以描述吸收性光学介质的消光性质：</w:t>
+      </w:r>
+    </w:p>
+    <w:p>
+      <w:pPr>
+        <w:spacing w:before="120" w:after="120"/>
+        <w:jc w:val="center"/>
+      </w:pPr>
       <w:r>
         <w:rPr>
           <w:rFonts w:ascii="Times New Roman" w:hAnsi="Times New Roman"/>
@@ -3908,18 +3784,17 @@
           <w:color w:val="505050"/>
           <w:sz w:val="21"/>
         </w:rPr>
-      </w:r>
-    </w:p>
-    <w:p>
-      <w:r>
-        <w:rPr>
-          <w:rFonts w:ascii="SimSun" w:hAnsi="SimSun"/>
-          <w:sz w:val="21"/>
-        </w:rPr>
-        <w:t>E_{1,t} = E_{2,t}, \quad H_{1,t} = H_{2,t}</w:t>
-      </w:r>
-    </w:p>
-    <w:p>
+        <w:t>\tilde{n}(\lambda) = n(\lambda) + ik(\lambda)</w:t>
+      </w:r>
+    </w:p>
+    <w:p>
+      <w:r>
+        <w:rPr>
+          <w:rFonts w:ascii="SimSun" w:hAnsi="SimSun"/>
+          <w:sz w:val="21"/>
+        </w:rPr>
+        <w:t xml:space="preserve">本平台在计算特征矩阵时，直接调用该复折射率。其虚部（消光系数/消光常数）决定了传播相位延迟 </w:t>
+      </w:r>
       <w:r>
         <w:rPr>
           <w:rFonts w:ascii="Times New Roman" w:hAnsi="Times New Roman"/>
@@ -3927,15 +3802,14 @@
           <w:color w:val="505050"/>
           <w:sz w:val="21"/>
         </w:rPr>
-      </w:r>
-    </w:p>
-    <w:p>
-      <w:r>
-        <w:rPr>
-          <w:rFonts w:ascii="SimSun" w:hAnsi="SimSun"/>
-          <w:sz w:val="21"/>
-        </w:rPr>
-        <w:t>本平台传输矩阵（TMM）的核心递推关系即由该一维边界连续性条件级联而成。</w:t>
+        <w:t>\delta</w:t>
+      </w:r>
+      <w:r>
+        <w:rPr>
+          <w:rFonts w:ascii="SimSun" w:hAnsi="SimSun"/>
+          <w:sz w:val="21"/>
+        </w:rPr>
+        <w:t xml:space="preserve"> 中的虚部，用于实现带间吸收损耗计算。具体符号取决于时间因子约定。</w:t>
       </w:r>
     </w:p>
     <w:p>
@@ -3949,16 +3823,16 @@
           <w:b/>
           <w:sz w:val="22"/>
         </w:rPr>
-        <w:t>2.6.2 平面波、复折射率与材料吸收</w:t>
-      </w:r>
-    </w:p>
-    <w:p>
-      <w:r>
-        <w:rPr>
-          <w:rFonts w:ascii="SimSun" w:hAnsi="SimSun"/>
-          <w:sz w:val="21"/>
-        </w:rPr>
-        <w:t xml:space="preserve">单色简谐平面波沿 </w:t>
+        <w:t>2.6.3 能量守恒与 R/T/A 物理约束</w:t>
+      </w:r>
+    </w:p>
+    <w:p>
+      <w:r>
+        <w:rPr>
+          <w:rFonts w:ascii="SimSun" w:hAnsi="SimSun"/>
+          <w:sz w:val="21"/>
+        </w:rPr>
+        <w:t xml:space="preserve">根据电磁场能流密度（Poynting 矢量）的守恒律，对于任意各向同性介质薄膜系统，反射率 </w:t>
       </w:r>
       <w:r>
         <w:rPr>
@@ -3967,17 +3841,15 @@
           <w:color w:val="505050"/>
           <w:sz w:val="21"/>
         </w:rPr>
-        <w:t>z</w:t>
-      </w:r>
-      <w:r>
-        <w:rPr>
-          <w:rFonts w:ascii="SimSun" w:hAnsi="SimSun"/>
-          <w:sz w:val="21"/>
-        </w:rPr>
-        <w:t xml:space="preserve"> 方向在一维薄膜层中传播时，电场复振幅形式为：</w:t>
-      </w:r>
-    </w:p>
-    <w:p>
+        <w:t>R</w:t>
+      </w:r>
+      <w:r>
+        <w:rPr>
+          <w:rFonts w:ascii="SimSun" w:hAnsi="SimSun"/>
+          <w:sz w:val="21"/>
+        </w:rPr>
+        <w:t xml:space="preserve">、透射率 </w:t>
+      </w:r>
       <w:r>
         <w:rPr>
           <w:rFonts w:ascii="Times New Roman" w:hAnsi="Times New Roman"/>
@@ -3985,18 +3857,15 @@
           <w:color w:val="505050"/>
           <w:sz w:val="21"/>
         </w:rPr>
-      </w:r>
-    </w:p>
-    <w:p>
-      <w:r>
-        <w:rPr>
-          <w:rFonts w:ascii="SimSun" w:hAnsi="SimSun"/>
-          <w:sz w:val="21"/>
-        </w:rPr>
-        <w:t>E(z) = E_0 e^{-i k_z z}</w:t>
-      </w:r>
-    </w:p>
-    <w:p>
+        <w:t>T</w:t>
+      </w:r>
+      <w:r>
+        <w:rPr>
+          <w:rFonts w:ascii="SimSun" w:hAnsi="SimSun"/>
+          <w:sz w:val="21"/>
+        </w:rPr>
+        <w:t xml:space="preserve"> 和吸收率 </w:t>
+      </w:r>
       <w:r>
         <w:rPr>
           <w:rFonts w:ascii="Times New Roman" w:hAnsi="Times New Roman"/>
@@ -4004,27 +3873,21 @@
           <w:color w:val="505050"/>
           <w:sz w:val="21"/>
         </w:rPr>
-      </w:r>
-    </w:p>
-    <w:p>
-      <w:r>
-        <w:rPr>
-          <w:rFonts w:ascii="SimSun" w:hAnsi="SimSun"/>
-          <w:sz w:val="21"/>
-        </w:rPr>
-        <w:t>该公式用于平台腔内电场空间分布的相位计算，是确定每一层相位延迟的理论依据。</w:t>
-      </w:r>
-    </w:p>
-    <w:p>
-      <w:r>
-        <w:rPr>
-          <w:rFonts w:ascii="SimSun" w:hAnsi="SimSun"/>
-          <w:sz w:val="21"/>
-        </w:rPr>
-        <w:t>引入复折射率以描述吸收性光学介质的消光性质：</w:t>
-      </w:r>
-    </w:p>
-    <w:p>
+        <w:t>A</w:t>
+      </w:r>
+      <w:r>
+        <w:rPr>
+          <w:rFonts w:ascii="SimSun" w:hAnsi="SimSun"/>
+          <w:sz w:val="21"/>
+        </w:rPr>
+        <w:t xml:space="preserve"> 在能量上必须受到以下守恒条件的约束：</w:t>
+      </w:r>
+    </w:p>
+    <w:p>
+      <w:pPr>
+        <w:spacing w:before="120" w:after="120"/>
+        <w:jc w:val="center"/>
+      </w:pPr>
       <w:r>
         <w:rPr>
           <w:rFonts w:ascii="Times New Roman" w:hAnsi="Times New Roman"/>
@@ -4032,18 +3895,55 @@
           <w:color w:val="505050"/>
           <w:sz w:val="21"/>
         </w:rPr>
-      </w:r>
-    </w:p>
-    <w:p>
-      <w:r>
-        <w:rPr>
-          <w:rFonts w:ascii="SimSun" w:hAnsi="SimSun"/>
-          <w:sz w:val="21"/>
-        </w:rPr>
-        <w:t>\tilde{n}(\lambda) = n(\lambda) + ik(\lambda)</w:t>
-      </w:r>
-    </w:p>
-    <w:p>
+        <w:t>R + T + A \equiv 1.0</w:t>
+      </w:r>
+    </w:p>
+    <w:p>
+      <w:r>
+        <w:rPr>
+          <w:rFonts w:ascii="SimSun" w:hAnsi="SimSun"/>
+          <w:sz w:val="21"/>
+        </w:rPr>
+        <w:t xml:space="preserve">在测试套件 </w:t>
+      </w:r>
+      <w:r>
+        <w:rPr>
+          <w:rFonts w:ascii="Consolas" w:hAnsi="Consolas"/>
+          <w:color w:val="A52A2A"/>
+          <w:sz w:val="20"/>
+        </w:rPr>
+        <w:t>tests/test_tmm_core.py</w:t>
+      </w:r>
+      <w:r>
+        <w:rPr>
+          <w:rFonts w:ascii="SimSun" w:hAnsi="SimSun"/>
+          <w:sz w:val="21"/>
+        </w:rPr>
+        <w:t xml:space="preserve"> 中，该恒等式被写为核心物理一致性断言，用于捕获和防止计算溢出或物理漏算。</w:t>
+      </w:r>
+    </w:p>
+    <w:p>
+      <w:pPr>
+        <w:keepNext/>
+        <w:spacing w:before="120" w:after="80"/>
+      </w:pPr>
+      <w:r>
+        <w:rPr>
+          <w:rFonts w:ascii="SimHei" w:hAnsi="SimHei"/>
+          <w:b/>
+          <w:sz w:val="22"/>
+        </w:rPr>
+        <w:t>2.6.4 相位干涉条件与典型膜系设计</w:t>
+      </w:r>
+    </w:p>
+    <w:p>
+      <w:r>
+        <w:rPr>
+          <w:rFonts w:ascii="SimSun" w:hAnsi="SimSun"/>
+          <w:sz w:val="21"/>
+        </w:rPr>
+        <w:t xml:space="preserve">一维共振腔或布拉格反射镜（DBR）在设计波长 </w:t>
+      </w:r>
       <w:r>
         <w:rPr>
           <w:rFonts w:ascii="Times New Roman" w:hAnsi="Times New Roman"/>
@@ -4051,16 +3951,21 @@
           <w:color w:val="505050"/>
           <w:sz w:val="21"/>
         </w:rPr>
-      </w:r>
-    </w:p>
-    <w:p>
-      <w:r>
-        <w:rPr>
-          <w:rFonts w:ascii="SimSun" w:hAnsi="SimSun"/>
-          <w:sz w:val="21"/>
-        </w:rPr>
-        <w:t xml:space="preserve">本平台在计算特征矩阵时，直接调用该复折射率。其虚部（消光系数/消光常数）决定了传播相位延迟 </w:t>
-      </w:r>
+        <w:t>\lambda_0</w:t>
+      </w:r>
+      <w:r>
+        <w:rPr>
+          <w:rFonts w:ascii="SimSun" w:hAnsi="SimSun"/>
+          <w:sz w:val="21"/>
+        </w:rPr>
+        <w:t xml:space="preserve"> 处的厚度匹配通常需要满足相长/相消干涉的光学厚度条件：</w:t>
+      </w:r>
+    </w:p>
+    <w:p>
+      <w:pPr>
+        <w:spacing w:before="120" w:after="120"/>
+        <w:jc w:val="center"/>
+      </w:pPr>
       <w:r>
         <w:rPr>
           <w:rFonts w:ascii="Times New Roman" w:hAnsi="Times New Roman"/>
@@ -4068,37 +3973,25 @@
           <w:color w:val="505050"/>
           <w:sz w:val="21"/>
         </w:rPr>
-        <w:t>\delta</w:t>
-      </w:r>
-      <w:r>
-        <w:rPr>
-          <w:rFonts w:ascii="SimSun" w:hAnsi="SimSun"/>
-          <w:sz w:val="21"/>
-        </w:rPr>
-        <w:t xml:space="preserve"> 中的虚部，用于实现带间吸收损耗计算。具体符号取决于时间因子约定。</w:t>
-      </w:r>
-    </w:p>
-    <w:p>
-      <w:pPr>
-        <w:keepNext/>
-        <w:spacing w:before="120" w:after="80"/>
-      </w:pPr>
-      <w:r>
-        <w:rPr>
-          <w:rFonts w:ascii="SimHei" w:hAnsi="SimHei"/>
-          <w:b/>
-          <w:sz w:val="22"/>
-        </w:rPr>
-        <w:t>2.6.3 能量守恒与 R/T/A 物理约束</w:t>
-      </w:r>
-    </w:p>
-    <w:p>
-      <w:r>
-        <w:rPr>
-          <w:rFonts w:ascii="SimSun" w:hAnsi="SimSun"/>
-          <w:sz w:val="21"/>
-        </w:rPr>
-        <w:t xml:space="preserve">根据电磁场能流密度（Poynting 矢量）的守恒律，对于任意各向同性介质薄膜系统，反射率 </w:t>
+        <w:t>n_j d_j = \frac{\lambda_0}{4}</w:t>
+      </w:r>
+    </w:p>
+    <w:p>
+      <w:r>
+        <w:rPr>
+          <w:rFonts w:ascii="SimSun" w:hAnsi="SimSun"/>
+          <w:sz w:val="21"/>
+        </w:rPr>
+        <w:t>在教学模块中，该 1/4 波长条件用于自动配置高反膜的对称各层几何厚度。</w:t>
+      </w:r>
+    </w:p>
+    <w:p>
+      <w:r>
+        <w:rPr>
+          <w:rFonts w:ascii="SimSun" w:hAnsi="SimSun"/>
+          <w:sz w:val="21"/>
+        </w:rPr>
+        <w:t xml:space="preserve">对于 Tamm 界面局域激发的复振幅反射系数相位角 </w:t>
       </w:r>
       <w:r>
         <w:rPr>
@@ -4107,15 +4000,21 @@
           <w:color w:val="505050"/>
           <w:sz w:val="21"/>
         </w:rPr>
-        <w:t>R</w:t>
-      </w:r>
-      <w:r>
-        <w:rPr>
-          <w:rFonts w:ascii="SimSun" w:hAnsi="SimSun"/>
-          <w:sz w:val="21"/>
-        </w:rPr>
-        <w:t xml:space="preserve">、透射率 </w:t>
-      </w:r>
+        <w:t>\phi</w:t>
+      </w:r>
+      <w:r>
+        <w:rPr>
+          <w:rFonts w:ascii="SimSun" w:hAnsi="SimSun"/>
+          <w:sz w:val="21"/>
+        </w:rPr>
+        <w:t>，在共振匹配点需满足相位差极值条件：</w:t>
+      </w:r>
+    </w:p>
+    <w:p>
+      <w:pPr>
+        <w:spacing w:before="120" w:after="120"/>
+        <w:jc w:val="center"/>
+      </w:pPr>
       <w:r>
         <w:rPr>
           <w:rFonts w:ascii="Times New Roman" w:hAnsi="Times New Roman"/>
@@ -4123,214 +4022,7 @@
           <w:color w:val="505050"/>
           <w:sz w:val="21"/>
         </w:rPr>
-        <w:t>T</w:t>
-      </w:r>
-      <w:r>
-        <w:rPr>
-          <w:rFonts w:ascii="SimSun" w:hAnsi="SimSun"/>
-          <w:sz w:val="21"/>
-        </w:rPr>
-        <w:t xml:space="preserve"> 和吸收率 </w:t>
-      </w:r>
-      <w:r>
-        <w:rPr>
-          <w:rFonts w:ascii="Times New Roman" w:hAnsi="Times New Roman"/>
-          <w:i/>
-          <w:color w:val="505050"/>
-          <w:sz w:val="21"/>
-        </w:rPr>
-        <w:t>A</w:t>
-      </w:r>
-      <w:r>
-        <w:rPr>
-          <w:rFonts w:ascii="SimSun" w:hAnsi="SimSun"/>
-          <w:sz w:val="21"/>
-        </w:rPr>
-        <w:t xml:space="preserve"> 在能量上必须受到以下守恒条件的约束：</w:t>
-      </w:r>
-    </w:p>
-    <w:p>
-      <w:r>
-        <w:rPr>
-          <w:rFonts w:ascii="Times New Roman" w:hAnsi="Times New Roman"/>
-          <w:i/>
-          <w:color w:val="505050"/>
-          <w:sz w:val="21"/>
-        </w:rPr>
-      </w:r>
-    </w:p>
-    <w:p>
-      <w:r>
-        <w:rPr>
-          <w:rFonts w:ascii="SimSun" w:hAnsi="SimSun"/>
-          <w:sz w:val="21"/>
-        </w:rPr>
-        <w:t>R + T + A \equiv 1.0</w:t>
-      </w:r>
-    </w:p>
-    <w:p>
-      <w:r>
-        <w:rPr>
-          <w:rFonts w:ascii="Times New Roman" w:hAnsi="Times New Roman"/>
-          <w:i/>
-          <w:color w:val="505050"/>
-          <w:sz w:val="21"/>
-        </w:rPr>
-      </w:r>
-    </w:p>
-    <w:p>
-      <w:r>
-        <w:rPr>
-          <w:rFonts w:ascii="SimSun" w:hAnsi="SimSun"/>
-          <w:sz w:val="21"/>
-        </w:rPr>
-        <w:t xml:space="preserve">在测试套件 </w:t>
-      </w:r>
-      <w:r>
-        <w:rPr>
-          <w:rFonts w:ascii="Consolas" w:hAnsi="Consolas"/>
-          <w:color w:val="A52A2A"/>
-          <w:sz w:val="20"/>
-        </w:rPr>
-        <w:t>tests/test_tmm_core.py</w:t>
-      </w:r>
-      <w:r>
-        <w:rPr>
-          <w:rFonts w:ascii="SimSun" w:hAnsi="SimSun"/>
-          <w:sz w:val="21"/>
-        </w:rPr>
-        <w:t xml:space="preserve"> 中，该恒等式被写为核心物理一致性断言，用于捕获和防止计算溢出或物理漏算。</w:t>
-      </w:r>
-    </w:p>
-    <w:p>
-      <w:pPr>
-        <w:keepNext/>
-        <w:spacing w:before="120" w:after="80"/>
-      </w:pPr>
-      <w:r>
-        <w:rPr>
-          <w:rFonts w:ascii="SimHei" w:hAnsi="SimHei"/>
-          <w:b/>
-          <w:sz w:val="22"/>
-        </w:rPr>
-        <w:t>2.6.4 相位干涉条件与典型膜系设计</w:t>
-      </w:r>
-    </w:p>
-    <w:p>
-      <w:r>
-        <w:rPr>
-          <w:rFonts w:ascii="SimSun" w:hAnsi="SimSun"/>
-          <w:sz w:val="21"/>
-        </w:rPr>
-        <w:t xml:space="preserve">一维共振腔或布拉格反射镜（DBR）在设计波长 </w:t>
-      </w:r>
-      <w:r>
-        <w:rPr>
-          <w:rFonts w:ascii="Times New Roman" w:hAnsi="Times New Roman"/>
-          <w:i/>
-          <w:color w:val="505050"/>
-          <w:sz w:val="21"/>
-        </w:rPr>
-        <w:t>\lambda_0</w:t>
-      </w:r>
-      <w:r>
-        <w:rPr>
-          <w:rFonts w:ascii="SimSun" w:hAnsi="SimSun"/>
-          <w:sz w:val="21"/>
-        </w:rPr>
-        <w:t xml:space="preserve"> 处的厚度匹配通常需要满足相长/相消干涉的光学厚度条件：</w:t>
-      </w:r>
-    </w:p>
-    <w:p>
-      <w:r>
-        <w:rPr>
-          <w:rFonts w:ascii="Times New Roman" w:hAnsi="Times New Roman"/>
-          <w:i/>
-          <w:color w:val="505050"/>
-          <w:sz w:val="21"/>
-        </w:rPr>
-      </w:r>
-    </w:p>
-    <w:p>
-      <w:r>
-        <w:rPr>
-          <w:rFonts w:ascii="SimSun" w:hAnsi="SimSun"/>
-          <w:sz w:val="21"/>
-        </w:rPr>
-        <w:t>n_j d_j = \frac{\lambda_0}{4}</w:t>
-      </w:r>
-    </w:p>
-    <w:p>
-      <w:r>
-        <w:rPr>
-          <w:rFonts w:ascii="Times New Roman" w:hAnsi="Times New Roman"/>
-          <w:i/>
-          <w:color w:val="505050"/>
-          <w:sz w:val="21"/>
-        </w:rPr>
-      </w:r>
-    </w:p>
-    <w:p>
-      <w:r>
-        <w:rPr>
-          <w:rFonts w:ascii="SimSun" w:hAnsi="SimSun"/>
-          <w:sz w:val="21"/>
-        </w:rPr>
-        <w:t>在教学模块中，该 1/4 波长条件用于自动配置高反膜的对称各层几何厚度。</w:t>
-      </w:r>
-    </w:p>
-    <w:p>
-      <w:r>
-        <w:rPr>
-          <w:rFonts w:ascii="SimSun" w:hAnsi="SimSun"/>
-          <w:sz w:val="21"/>
-        </w:rPr>
-        <w:t xml:space="preserve">对于 Tamm 界面局域激发的复振幅反射系数相位角 </w:t>
-      </w:r>
-      <w:r>
-        <w:rPr>
-          <w:rFonts w:ascii="Times New Roman" w:hAnsi="Times New Roman"/>
-          <w:i/>
-          <w:color w:val="505050"/>
-          <w:sz w:val="21"/>
-        </w:rPr>
-        <w:t>\phi</w:t>
-      </w:r>
-      <w:r>
-        <w:rPr>
-          <w:rFonts w:ascii="SimSun" w:hAnsi="SimSun"/>
-          <w:sz w:val="21"/>
-        </w:rPr>
-        <w:t>，在共振匹配点需满足相位差极值条件：</w:t>
-      </w:r>
-    </w:p>
-    <w:p>
-      <w:r>
-        <w:rPr>
-          <w:rFonts w:ascii="Times New Roman" w:hAnsi="Times New Roman"/>
-          <w:i/>
-          <w:color w:val="505050"/>
-          <w:sz w:val="21"/>
-        </w:rPr>
-      </w:r>
-    </w:p>
-    <w:p>
-      <w:r>
-        <w:rPr>
-          <w:rFonts w:ascii="SimSun" w:hAnsi="SimSun"/>
-          <w:sz w:val="21"/>
-        </w:rPr>
         <w:t>\Delta\phi = \phi_{left}(\lambda) + \phi_{right}(\lambda) = 2m\pi \quad (m \in \mathbb{Z})</w:t>
-      </w:r>
-    </w:p>
-    <w:p>
-      <w:r>
-        <w:rPr>
-          <w:rFonts w:ascii="Times New Roman" w:hAnsi="Times New Roman"/>
-          <w:i/>
-          <w:color w:val="505050"/>
-          <w:sz w:val="21"/>
-        </w:rPr>
       </w:r>
     </w:p>
     <w:p>
@@ -12033,23 +11725,7 @@
           <w:rFonts w:ascii="SimSun" w:hAnsi="SimSun"/>
           <w:sz w:val="21"/>
         </w:rPr>
-        <w:t xml:space="preserve"> nm。利用 TMM 内核计算并绘制 </w:t>
-      </w:r>
-      <w:r>
-        <w:rPr>
-          <w:rFonts w:ascii="Times New Roman" w:hAnsi="Times New Roman"/>
-          <w:i/>
-          <w:color w:val="505050"/>
-          <w:sz w:val="21"/>
-        </w:rPr>
-        <w:t>300\sim800</w:t>
-      </w:r>
-      <w:r>
-        <w:rPr>
-          <w:rFonts w:ascii="SimSun" w:hAnsi="SimSun"/>
-          <w:sz w:val="21"/>
-        </w:rPr>
-        <w:t xml:space="preserve"> nm 范围内的光强反射光谱线。</w:t>
+        <w:t xml:space="preserve"> nm。利用 TMM 内核计算并绘制 300–800 nm 范围内的光强反射光谱线。</w:t>
       </w:r>
     </w:p>
     <w:p>
@@ -12076,23 +11752,7 @@
           <w:rFonts w:ascii="SimSun" w:hAnsi="SimSun"/>
           <w:sz w:val="21"/>
         </w:rPr>
-        <w:t xml:space="preserve">：在 </w:t>
-      </w:r>
-      <w:r>
-        <w:rPr>
-          <w:rFonts w:ascii="Times New Roman" w:hAnsi="Times New Roman"/>
-          <w:i/>
-          <w:color w:val="505050"/>
-          <w:sz w:val="21"/>
-        </w:rPr>
-        <w:t>550</w:t>
-      </w:r>
-      <w:r>
-        <w:rPr>
-          <w:rFonts w:ascii="SimSun" w:hAnsi="SimSun"/>
-          <w:sz w:val="21"/>
-        </w:rPr>
-        <w:t xml:space="preserve"> nm 处反射率出现零点极小值，相比于裸玻璃界面的 </w:t>
+        <w:t xml:space="preserve">：在 550 nm 处反射率出现零点极小值，相比于裸玻璃界面的 </w:t>
       </w:r>
       <w:r>
         <w:rPr>
@@ -12732,39 +12392,7 @@
           <w:rFonts w:ascii="SimSun" w:hAnsi="SimSun"/>
           <w:sz w:val="21"/>
         </w:rPr>
-        <w:t xml:space="preserve">：两端高反镜各为 5 对 H/L 1/4 波长膜堆（中心波长 </w:t>
-      </w:r>
-      <w:r>
-        <w:rPr>
-          <w:rFonts w:ascii="Times New Roman" w:hAnsi="Times New Roman"/>
-          <w:i/>
-          <w:color w:val="505050"/>
-          <w:sz w:val="21"/>
-        </w:rPr>
-        <w:t>500</w:t>
-      </w:r>
-      <w:r>
-        <w:rPr>
-          <w:rFonts w:ascii="SimSun" w:hAnsi="SimSun"/>
-          <w:sz w:val="21"/>
-        </w:rPr>
-        <w:t xml:space="preserve"> nm），中间腔层厚度为 </w:t>
-      </w:r>
-      <w:r>
-        <w:rPr>
-          <w:rFonts w:ascii="Times New Roman" w:hAnsi="Times New Roman"/>
-          <w:i/>
-          <w:color w:val="505050"/>
-          <w:sz w:val="21"/>
-        </w:rPr>
-        <w:t>500</w:t>
-      </w:r>
-      <w:r>
-        <w:rPr>
-          <w:rFonts w:ascii="SimSun" w:hAnsi="SimSun"/>
-          <w:sz w:val="21"/>
-        </w:rPr>
-        <w:t xml:space="preserve"> nm 的 </w:t>
+        <w:t xml:space="preserve">：两端高反镜各为 5 对 H/L 1/4 波长膜堆（中心波长 500 nm），中间腔层厚度为 500 nm 的 </w:t>
       </w:r>
       <w:r>
         <w:rPr>
@@ -13272,23 +12900,7 @@
           <w:rFonts w:ascii="SimSun" w:hAnsi="SimSun"/>
           <w:sz w:val="21"/>
         </w:rPr>
-        <w:t xml:space="preserve">：对上述对称 F-P 微腔（中心共振波长 </w:t>
-      </w:r>
-      <w:r>
-        <w:rPr>
-          <w:rFonts w:ascii="Times New Roman" w:hAnsi="Times New Roman"/>
-          <w:i/>
-          <w:color w:val="505050"/>
-          <w:sz w:val="21"/>
-        </w:rPr>
-        <w:t>500</w:t>
-      </w:r>
-      <w:r>
-        <w:rPr>
-          <w:rFonts w:ascii="SimSun" w:hAnsi="SimSun"/>
-          <w:sz w:val="21"/>
-        </w:rPr>
-        <w:t xml:space="preserve"> nm）在正入射下进行多层一维波动电场分布的正反向矩阵递推计算。</w:t>
+        <w:t>：对上述对称 F-P 微腔（中心共振波长 500 nm）在正入射下进行多层一维波动电场分布的正反向矩阵递推计算。</w:t>
       </w:r>
     </w:p>
     <w:p>
@@ -13564,39 +13176,7 @@
           <w:rFonts w:ascii="SimSun" w:hAnsi="SimSun"/>
           <w:sz w:val="21"/>
         </w:rPr>
-        <w:t xml:space="preserve">：设计在玻璃基底上厚度为 </w:t>
-      </w:r>
-      <w:r>
-        <w:rPr>
-          <w:rFonts w:ascii="Times New Roman" w:hAnsi="Times New Roman"/>
-          <w:i/>
-          <w:color w:val="505050"/>
-          <w:sz w:val="21"/>
-        </w:rPr>
-        <w:t>50</w:t>
-      </w:r>
-      <w:r>
-        <w:rPr>
-          <w:rFonts w:ascii="SimSun" w:hAnsi="SimSun"/>
-          <w:sz w:val="21"/>
-        </w:rPr>
-        <w:t xml:space="preserve"> nm 的 Au（金）或 Ag（银）薄膜，导入 Johnson-Christy 金/银实测 nk 数据表，利用线性插值映射到仿真网格，计算并在 </w:t>
-      </w:r>
-      <w:r>
-        <w:rPr>
-          <w:rFonts w:ascii="Times New Roman" w:hAnsi="Times New Roman"/>
-          <w:i/>
-          <w:color w:val="505050"/>
-          <w:sz w:val="21"/>
-        </w:rPr>
-        <w:t>200\sim1000</w:t>
-      </w:r>
-      <w:r>
-        <w:rPr>
-          <w:rFonts w:ascii="SimSun" w:hAnsi="SimSun"/>
-          <w:sz w:val="21"/>
-        </w:rPr>
-        <w:t xml:space="preserve"> nm 光谱段对比真实色散的光谱表现。</w:t>
+        <w:t>：设计在玻璃基底上厚度为 50 nm 的 Au（金）或 Ag（银）薄膜，导入 Johnson-Christy 金/银实测 nk 数据表，利用线性插值映射到仿真网格，计算并在 200–1000 nm 光谱段对比真实色散的光谱表现。</w:t>
       </w:r>
     </w:p>
     <w:p>
@@ -13842,7 +13422,7 @@
           <w:rFonts w:ascii="SimSun" w:hAnsi="SimSun"/>
           <w:sz w:val="21"/>
         </w:rPr>
-        <w:t xml:space="preserve">：设置 </w:t>
+        <w:t xml:space="preserve">：设置 200 nm 厚的单层 Si（硅）薄膜在玻璃基底上，计算对比采用真实 Aspnes 色散与采用常数近似折射率 </w:t>
       </w:r>
       <w:r>
         <w:rPr>
@@ -13851,22 +13431,6 @@
           <w:color w:val="505050"/>
           <w:sz w:val="21"/>
         </w:rPr>
-        <w:t>200</w:t>
-      </w:r>
-      <w:r>
-        <w:rPr>
-          <w:rFonts w:ascii="SimSun" w:hAnsi="SimSun"/>
-          <w:sz w:val="21"/>
-        </w:rPr>
-        <w:t xml:space="preserve"> nm 厚的单层 Si（硅）薄膜在玻璃基底上，计算对比采用真实 Aspnes 色散与采用常数近似折射率 </w:t>
-      </w:r>
-      <w:r>
-        <w:rPr>
-          <w:rFonts w:ascii="Times New Roman" w:hAnsi="Times New Roman"/>
-          <w:i/>
-          <w:color w:val="505050"/>
-          <w:sz w:val="21"/>
-        </w:rPr>
         <w:t>n=3.4</w:t>
       </w:r>
       <w:r>
@@ -13874,23 +13438,7 @@
           <w:rFonts w:ascii="SimSun" w:hAnsi="SimSun"/>
           <w:sz w:val="21"/>
         </w:rPr>
-        <w:t xml:space="preserve"> 在 </w:t>
-      </w:r>
-      <w:r>
-        <w:rPr>
-          <w:rFonts w:ascii="Times New Roman" w:hAnsi="Times New Roman"/>
-          <w:i/>
-          <w:color w:val="505050"/>
-          <w:sz w:val="21"/>
-        </w:rPr>
-        <w:t>300\sim1100</w:t>
-      </w:r>
-      <w:r>
-        <w:rPr>
-          <w:rFonts w:ascii="SimSun" w:hAnsi="SimSun"/>
-          <w:sz w:val="21"/>
-        </w:rPr>
-        <w:t xml:space="preserve"> nm 波段的反射干涉特征。</w:t>
+        <w:t xml:space="preserve"> 在 300–1100 nm 波段的反射干涉特征。</w:t>
       </w:r>
     </w:p>
     <w:p>
@@ -14163,23 +13711,7 @@
           <w:rFonts w:ascii="SimSun" w:hAnsi="SimSun"/>
           <w:sz w:val="21"/>
         </w:rPr>
-        <w:t xml:space="preserve">：在 </w:t>
-      </w:r>
-      <w:r>
-        <w:rPr>
-          <w:rFonts w:ascii="Times New Roman" w:hAnsi="Times New Roman"/>
-          <w:i/>
-          <w:color w:val="505050"/>
-          <w:sz w:val="21"/>
-        </w:rPr>
-        <w:t>350</w:t>
-      </w:r>
-      <w:r>
-        <w:rPr>
-          <w:rFonts w:ascii="SimSun" w:hAnsi="SimSun"/>
-          <w:sz w:val="21"/>
-        </w:rPr>
-        <w:t xml:space="preserve"> nm 以下波段，布拉格反射镜的高反带隙截止边缘发生了剧烈的扭曲和反射率塌陷，与 TiO2 的实测紫外带隙跃迁阈值趋势一致。</w:t>
+        <w:t>：在 350 nm 以下波段，布拉格反射镜的高反带隙截止边缘发生了剧烈的扭曲和反射率塌陷，与 TiO2 的实测紫外带隙跃迁阈值趋势一致。</w:t>
       </w:r>
     </w:p>
     <w:p>
@@ -14385,23 +13917,7 @@
           <w:rFonts w:ascii="SimSun" w:hAnsi="SimSun"/>
           <w:sz w:val="21"/>
         </w:rPr>
-        <w:t xml:space="preserve">：利用多层渐变或干涉耦合原理，在硅基底（高折射率、强色散吸收）上级联多层介质膜，对 </w:t>
-      </w:r>
-      <w:r>
-        <w:rPr>
-          <w:rFonts w:ascii="Times New Roman" w:hAnsi="Times New Roman"/>
-          <w:i/>
-          <w:color w:val="505050"/>
-          <w:sz w:val="21"/>
-        </w:rPr>
-        <w:t>300\sim1100</w:t>
-      </w:r>
-      <w:r>
-        <w:rPr>
-          <w:rFonts w:ascii="SimSun" w:hAnsi="SimSun"/>
-          <w:sz w:val="21"/>
-        </w:rPr>
-        <w:t xml:space="preserve"> nm 宽谱带的反射率进行全局压低，以提高光电流转化效率。</w:t>
+        <w:t>：利用多层渐变或干涉耦合原理，在硅基底（高折射率、强色散吸收）上级联多层介质膜，对 300–1100 nm 宽谱带的反射率进行全局压低，以提高光电流转化效率。</w:t>
       </w:r>
     </w:p>
     <w:p>
@@ -14674,39 +14190,7 @@
           <w:rFonts w:ascii="SimSun" w:hAnsi="SimSun"/>
           <w:sz w:val="21"/>
         </w:rPr>
-        <w:t xml:space="preserve">：设定中心波长 </w:t>
-      </w:r>
-      <w:r>
-        <w:rPr>
-          <w:rFonts w:ascii="Times New Roman" w:hAnsi="Times New Roman"/>
-          <w:i/>
-          <w:color w:val="505050"/>
-          <w:sz w:val="21"/>
-        </w:rPr>
-        <w:t>1550</w:t>
-      </w:r>
-      <w:r>
-        <w:rPr>
-          <w:rFonts w:ascii="SimSun" w:hAnsi="SimSun"/>
-          <w:sz w:val="21"/>
-        </w:rPr>
-        <w:t xml:space="preserve"> nm，设计 19 层 Ta2O5/SiO2 多腔滤波器，计算 </w:t>
-      </w:r>
-      <w:r>
-        <w:rPr>
-          <w:rFonts w:ascii="Times New Roman" w:hAnsi="Times New Roman"/>
-          <w:i/>
-          <w:color w:val="505050"/>
-          <w:sz w:val="21"/>
-        </w:rPr>
-        <w:t>1540\sim1560</w:t>
-      </w:r>
-      <w:r>
-        <w:rPr>
-          <w:rFonts w:ascii="SimSun" w:hAnsi="SimSun"/>
-          <w:sz w:val="21"/>
-        </w:rPr>
-        <w:t xml:space="preserve"> nm 反射与透射谱。</w:t>
+        <w:t>：设定中心波长 1550 nm，设计 19 层 Ta2O5/SiO2 多腔滤波器，计算 1540–1560 nm 反射与透射谱。</w:t>
       </w:r>
     </w:p>
     <w:p>
@@ -14733,23 +14217,7 @@
           <w:rFonts w:ascii="SimSun" w:hAnsi="SimSun"/>
           <w:sz w:val="21"/>
         </w:rPr>
-        <w:t xml:space="preserve">：结合图 4-10，在 </w:t>
-      </w:r>
-      <w:r>
-        <w:rPr>
-          <w:rFonts w:ascii="Times New Roman" w:hAnsi="Times New Roman"/>
-          <w:i/>
-          <w:color w:val="505050"/>
-          <w:sz w:val="21"/>
-        </w:rPr>
-        <w:t>1550</w:t>
-      </w:r>
-      <w:r>
-        <w:rPr>
-          <w:rFonts w:ascii="SimSun" w:hAnsi="SimSun"/>
-          <w:sz w:val="21"/>
-        </w:rPr>
-        <w:t xml:space="preserve"> nm 处成功实现了顶部平坦的高透射通带，且偏离中心波长仅 </w:t>
+        <w:t xml:space="preserve">：结合图 4-10，在 1550 nm 处成功实现了顶部平坦的高透射通带，且偏离中心波长仅 </w:t>
       </w:r>
       <w:r>
         <w:rPr>
@@ -15016,23 +14484,7 @@
           <w:rFonts w:ascii="SimSun" w:hAnsi="SimSun"/>
           <w:sz w:val="21"/>
         </w:rPr>
-        <w:t xml:space="preserve">：设置 25 层交替膜系在玻璃上，中心设计波长 </w:t>
-      </w:r>
-      <w:r>
-        <w:rPr>
-          <w:rFonts w:ascii="Times New Roman" w:hAnsi="Times New Roman"/>
-          <w:i/>
-          <w:color w:val="505050"/>
-          <w:sz w:val="21"/>
-        </w:rPr>
-        <w:t>1064</w:t>
-      </w:r>
-      <w:r>
-        <w:rPr>
-          <w:rFonts w:ascii="SimSun" w:hAnsi="SimSun"/>
-          <w:sz w:val="21"/>
-        </w:rPr>
-        <w:t xml:space="preserve"> nm，运行单色电磁反射光谱仿真。</w:t>
+        <w:t>：设置 25 层交替膜系在玻璃上，中心设计波长 1064 nm，运行单色电磁反射光谱仿真。</w:t>
       </w:r>
     </w:p>
     <w:p>
@@ -15059,23 +14511,7 @@
           <w:rFonts w:ascii="SimSun" w:hAnsi="SimSun"/>
           <w:sz w:val="21"/>
         </w:rPr>
-        <w:t xml:space="preserve">：结合图 4-11，在 </w:t>
-      </w:r>
-      <w:r>
-        <w:rPr>
-          <w:rFonts w:ascii="Times New Roman" w:hAnsi="Times New Roman"/>
-          <w:i/>
-          <w:color w:val="505050"/>
-          <w:sz w:val="21"/>
-        </w:rPr>
-        <w:t>1064</w:t>
-      </w:r>
-      <w:r>
-        <w:rPr>
-          <w:rFonts w:ascii="SimSun" w:hAnsi="SimSun"/>
-          <w:sz w:val="21"/>
-        </w:rPr>
-        <w:t xml:space="preserve"> nm 中心波段反射率达到了 </w:t>
+        <w:t xml:space="preserve">：结合图 4-11，在 1064 nm 中心波段反射率达到了 </w:t>
       </w:r>
       <w:r>
         <w:rPr>
@@ -15272,23 +14708,7 @@
           <w:rFonts w:ascii="SimSun" w:hAnsi="SimSun"/>
           <w:sz w:val="21"/>
         </w:rPr>
-        <w:t>：展示多层干涉膜系相比于单层减反在可见光宽带波段（</w:t>
-      </w:r>
-      <w:r>
-        <w:rPr>
-          <w:rFonts w:ascii="Times New Roman" w:hAnsi="Times New Roman"/>
-          <w:i/>
-          <w:color w:val="505050"/>
-          <w:sz w:val="21"/>
-        </w:rPr>
-        <w:t>400\sim700</w:t>
-      </w:r>
-      <w:r>
-        <w:rPr>
-          <w:rFonts w:ascii="SimSun" w:hAnsi="SimSun"/>
-          <w:sz w:val="21"/>
-        </w:rPr>
-        <w:t xml:space="preserve"> nm）的反射抑制性能差异。</w:t>
+        <w:t>：展示多层干涉膜系相比于单层减反在可见光宽带波段（400–700 nm）的反射抑制性能差异。</w:t>
       </w:r>
     </w:p>
     <w:p>
@@ -15369,39 +14789,7 @@
           <w:rFonts w:ascii="SimSun" w:hAnsi="SimSun"/>
           <w:sz w:val="21"/>
         </w:rPr>
-        <w:t xml:space="preserve">：结合图 4-12，单层减反仅在 </w:t>
-      </w:r>
-      <w:r>
-        <w:rPr>
-          <w:rFonts w:ascii="Times New Roman" w:hAnsi="Times New Roman"/>
-          <w:i/>
-          <w:color w:val="505050"/>
-          <w:sz w:val="21"/>
-        </w:rPr>
-        <w:t>550</w:t>
-      </w:r>
-      <w:r>
-        <w:rPr>
-          <w:rFonts w:ascii="SimSun" w:hAnsi="SimSun"/>
-          <w:sz w:val="21"/>
-        </w:rPr>
-        <w:t xml:space="preserve"> nm 中心波长产生一个反射极小值点，而多层膜结构在 </w:t>
-      </w:r>
-      <w:r>
-        <w:rPr>
-          <w:rFonts w:ascii="Times New Roman" w:hAnsi="Times New Roman"/>
-          <w:i/>
-          <w:color w:val="505050"/>
-          <w:sz w:val="21"/>
-        </w:rPr>
-        <w:t>400\sim700</w:t>
-      </w:r>
-      <w:r>
-        <w:rPr>
-          <w:rFonts w:ascii="SimSun" w:hAnsi="SimSun"/>
-          <w:sz w:val="21"/>
-        </w:rPr>
-        <w:t xml:space="preserve"> nm 可见光宽带范围内形成了宽阔平坦的低反射率波谷。</w:t>
+        <w:t>：结合图 4-12，单层减反仅在 550 nm 中心波长产生一个反射极小值点，而多层膜结构在 400–700 nm 可见光宽带范围内形成了宽阔平坦的低反射率波谷。</w:t>
       </w:r>
     </w:p>
     <w:p>
@@ -15620,23 +15008,7 @@
           <w:rFonts w:ascii="SimSun" w:hAnsi="SimSun"/>
           <w:sz w:val="21"/>
         </w:rPr>
-        <w:t xml:space="preserve">：设定 TiO2/Ag/TiO2 双介质夹金属三层夹心结构，计算 </w:t>
-      </w:r>
-      <w:r>
-        <w:rPr>
-          <w:rFonts w:ascii="Times New Roman" w:hAnsi="Times New Roman"/>
-          <w:i/>
-          <w:color w:val="505050"/>
-          <w:sz w:val="21"/>
-        </w:rPr>
-        <w:t>300\sim2000</w:t>
-      </w:r>
-      <w:r>
-        <w:rPr>
-          <w:rFonts w:ascii="SimSun" w:hAnsi="SimSun"/>
-          <w:sz w:val="21"/>
-        </w:rPr>
-        <w:t xml:space="preserve"> nm 反射和透射谱。</w:t>
+        <w:t>：设定 TiO2/Ag/TiO2 双介质夹金属三层夹心结构，计算 300–2000 nm 反射和透射谱。</w:t>
       </w:r>
     </w:p>
     <w:p>
@@ -15663,39 +15035,7 @@
           <w:rFonts w:ascii="SimSun" w:hAnsi="SimSun"/>
           <w:sz w:val="21"/>
         </w:rPr>
-        <w:t>：结合图 4-13，在可见光波段（</w:t>
-      </w:r>
-      <w:r>
-        <w:rPr>
-          <w:rFonts w:ascii="Times New Roman" w:hAnsi="Times New Roman"/>
-          <w:i/>
-          <w:color w:val="505050"/>
-          <w:sz w:val="21"/>
-        </w:rPr>
-        <w:t>400\sim700</w:t>
-      </w:r>
-      <w:r>
-        <w:rPr>
-          <w:rFonts w:ascii="SimSun" w:hAnsi="SimSun"/>
-          <w:sz w:val="21"/>
-        </w:rPr>
-        <w:t xml:space="preserve"> nm）透射率保持在 80% 以上，而在近红外波段（</w:t>
-      </w:r>
-      <w:r>
-        <w:rPr>
-          <w:rFonts w:ascii="Times New Roman" w:hAnsi="Times New Roman"/>
-          <w:i/>
-          <w:color w:val="505050"/>
-          <w:sz w:val="21"/>
-        </w:rPr>
-        <w:t>800</w:t>
-      </w:r>
-      <w:r>
-        <w:rPr>
-          <w:rFonts w:ascii="SimSun" w:hAnsi="SimSun"/>
-          <w:sz w:val="21"/>
-        </w:rPr>
-        <w:t xml:space="preserve"> nm 以上）透射率急剧截止，反射率迅速跃升到 90% 以上。</w:t>
+        <w:t>：结合图 4-13，在可见光波段（400–700 nm）透射率保持在 80% 以上，而在近红外波段（800 nm 以上）透射率急剧截止，反射率迅速跃升到 90% 以上。</w:t>
       </w:r>
     </w:p>
     <w:p>
@@ -15930,23 +15270,7 @@
           <w:rFonts w:ascii="SimSun" w:hAnsi="SimSun"/>
           <w:sz w:val="21"/>
         </w:rPr>
-        <w:t xml:space="preserve">：设计 </w:t>
-      </w:r>
-      <w:r>
-        <w:rPr>
-          <w:rFonts w:ascii="Times New Roman" w:hAnsi="Times New Roman"/>
-          <w:i/>
-          <w:color w:val="505050"/>
-          <w:sz w:val="21"/>
-        </w:rPr>
-        <w:t>40</w:t>
-      </w:r>
-      <w:r>
-        <w:rPr>
-          <w:rFonts w:ascii="SimSun" w:hAnsi="SimSun"/>
-          <w:sz w:val="21"/>
-        </w:rPr>
-        <w:t xml:space="preserve"> nm 金薄膜与 13 对 TiO2/SiO2 布拉格膜堆的级联边界，计算并寻找复合相位差为零的波长共振极值点。</w:t>
+        <w:t>：设计 40 nm 金薄膜与 13 对 TiO2/SiO2 布拉格膜堆的级联边界，计算并寻找复合相位差为零的波长共振极值点。</w:t>
       </w:r>
     </w:p>
     <w:p>
@@ -16138,7 +15462,7 @@
           <w:rFonts w:ascii="SimSun" w:hAnsi="SimSun"/>
           <w:sz w:val="21"/>
         </w:rPr>
-        <w:t xml:space="preserve">：复验基于真实色散材料的多层薄膜结构在 </w:t>
+        <w:t xml:space="preserve">：复验基于真实色散材料的多层薄膜结构在 8–13 </w:t>
       </w:r>
       <w:r>
         <w:rPr>
@@ -16147,22 +15471,6 @@
           <w:color w:val="505050"/>
           <w:sz w:val="21"/>
         </w:rPr>
-        <w:t>8\sim13</w:t>
-      </w:r>
-      <w:r>
-        <w:rPr>
-          <w:rFonts w:ascii="SimSun" w:hAnsi="SimSun"/>
-          <w:sz w:val="21"/>
-        </w:rPr>
-        <w:t xml:space="preserve"> </w:t>
-      </w:r>
-      <w:r>
-        <w:rPr>
-          <w:rFonts w:ascii="Times New Roman" w:hAnsi="Times New Roman"/>
-          <w:i/>
-          <w:color w:val="505050"/>
-          <w:sz w:val="21"/>
-        </w:rPr>
         <w:t>\mu</w:t>
       </w:r>
       <w:r>
@@ -16197,23 +15505,7 @@
           <w:rFonts w:ascii="SimSun" w:hAnsi="SimSun"/>
           <w:sz w:val="21"/>
         </w:rPr>
-        <w:t xml:space="preserve">：在大气窗口内具有超高热辐射发射率，同时在 </w:t>
-      </w:r>
-      <w:r>
-        <w:rPr>
-          <w:rFonts w:ascii="Times New Roman" w:hAnsi="Times New Roman"/>
-          <w:i/>
-          <w:color w:val="505050"/>
-          <w:sz w:val="21"/>
-        </w:rPr>
-        <w:t>300\sim2500</w:t>
-      </w:r>
-      <w:r>
-        <w:rPr>
-          <w:rFonts w:ascii="SimSun" w:hAnsi="SimSun"/>
-          <w:sz w:val="21"/>
-        </w:rPr>
-        <w:t xml:space="preserve"> nm 太阳光谱具有极高积分反射率（阻隔阳光加热），实现低于环境的被动冷却。</w:t>
+        <w:t>：在大气窗口内具有超高热辐射发射率，同时在 300–2500 nm 太阳光谱具有极高积分反射率（阻隔阳光加热），实现低于环境的被动冷却。</w:t>
       </w:r>
     </w:p>
     <w:p>
@@ -16502,55 +15794,7 @@
           <w:rFonts w:ascii="SimSun" w:hAnsi="SimSun"/>
           <w:sz w:val="21"/>
         </w:rPr>
-        <w:t xml:space="preserve">：槽深 </w:t>
-      </w:r>
-      <w:r>
-        <w:rPr>
-          <w:rFonts w:ascii="Times New Roman" w:hAnsi="Times New Roman"/>
-          <w:i/>
-          <w:color w:val="505050"/>
-          <w:sz w:val="21"/>
-        </w:rPr>
-        <w:t>400</w:t>
-      </w:r>
-      <w:r>
-        <w:rPr>
-          <w:rFonts w:ascii="SimSun" w:hAnsi="SimSun"/>
-          <w:sz w:val="21"/>
-        </w:rPr>
-        <w:t xml:space="preserve"> nm，周期 </w:t>
-      </w:r>
-      <w:r>
-        <w:rPr>
-          <w:rFonts w:ascii="Times New Roman" w:hAnsi="Times New Roman"/>
-          <w:i/>
-          <w:color w:val="505050"/>
-          <w:sz w:val="21"/>
-        </w:rPr>
-        <w:t>200</w:t>
-      </w:r>
-      <w:r>
-        <w:rPr>
-          <w:rFonts w:ascii="SimSun" w:hAnsi="SimSun"/>
-          <w:sz w:val="21"/>
-        </w:rPr>
-        <w:t xml:space="preserve"> nm，占空比为 0.5 的二氧化硅光栅，入射波长 </w:t>
-      </w:r>
-      <w:r>
-        <w:rPr>
-          <w:rFonts w:ascii="Times New Roman" w:hAnsi="Times New Roman"/>
-          <w:i/>
-          <w:color w:val="505050"/>
-          <w:sz w:val="21"/>
-        </w:rPr>
-        <w:t>1550</w:t>
-      </w:r>
-      <w:r>
-        <w:rPr>
-          <w:rFonts w:ascii="SimSun" w:hAnsi="SimSun"/>
-          <w:sz w:val="21"/>
-        </w:rPr>
-        <w:t xml:space="preserve"> nm。分别利用 rcwa.py（EMT等效）和 COMSOL 全波数值仿真计算光谱并进行 MAE 对照。</w:t>
+        <w:t>：槽深 400 nm，周期 200 nm，占空比为 0.5 的二氧化硅光栅，入射波长 1550 nm。分别利用 rcwa.py（EMT等效）和 COMSOL 全波数值仿真计算光谱并进行 MAE 对照。</w:t>
       </w:r>
     </w:p>
     <w:p>

</xml_diff>